<commit_message>
docs: add WAVE and WebPageTest results from the GitHub Pages deployment
Both pages were tested live: WAVE reports 0 errors and 0 contrast errors
for the optimised page (7 and 32 for the baseline), and WebPageTest
measured LCP 1.63 s vs 5.11 s on mobile 4G. The hosted runs also exposed
a 0.439 layout shift and a favicon 404 on the baseline.
</commit_message>
<xml_diff>
--- a/report.docx
+++ b/report.docx
@@ -484,7 +484,7 @@
                 <w:sz w:val="19"/>
                 <w:szCs w:val="19"/>
               </w:rPr>
-              <w:t xml:space="preserve">Audit date</w:t>
+              <w:t xml:space="preserve">Live site</w:t>
             </w:r>
           </w:p>
         </w:tc>
@@ -515,7 +515,71 @@
                 <w:sz w:val="19"/>
                 <w:szCs w:val="19"/>
               </w:rPr>
-              <w:t xml:space="preserve">23 October 2026 (results in reports/audit-summary.json)</w:t>
+              <w:t xml:space="preserve">https://takshaksinghania.github.io/frontend-internship-week4-performance-accessibility/ (baseline at /baseline/)</w:t>
+            </w:r>
+          </w:p>
+        </w:tc>
+      </w:tr>
+      <w:tr>
+        <w:tc>
+          <w:tcPr>
+            <w:tcW w:type="dxa" w:w="2600"/>
+            <w:tcBorders>
+              <w:top w:val="single" w:color="BFBFBF" w:sz="4"/>
+              <w:left w:val="single" w:color="BFBFBF" w:sz="4"/>
+              <w:bottom w:val="single" w:color="BFBFBF" w:sz="4"/>
+              <w:right w:val="single" w:color="BFBFBF" w:sz="4"/>
+            </w:tcBorders>
+            <w:tcMar>
+              <w:top w:type="dxa" w:w="60"/>
+              <w:left w:type="dxa" w:w="100"/>
+              <w:bottom w:type="dxa" w:w="60"/>
+              <w:right w:type="dxa" w:w="100"/>
+            </w:tcMar>
+          </w:tcPr>
+          <w:p>
+            <w:pPr>
+              <w:spacing w:after="0"/>
+            </w:pPr>
+            <w:r>
+              <w:rPr>
+                <w:b w:val="false"/>
+                <w:bCs w:val="false"/>
+                <w:sz w:val="19"/>
+                <w:szCs w:val="19"/>
+              </w:rPr>
+              <w:t xml:space="preserve">Audit dates</w:t>
+            </w:r>
+          </w:p>
+        </w:tc>
+        <w:tc>
+          <w:tcPr>
+            <w:tcW w:type="dxa" w:w="6426"/>
+            <w:tcBorders>
+              <w:top w:val="single" w:color="BFBFBF" w:sz="4"/>
+              <w:left w:val="single" w:color="BFBFBF" w:sz="4"/>
+              <w:bottom w:val="single" w:color="BFBFBF" w:sz="4"/>
+              <w:right w:val="single" w:color="BFBFBF" w:sz="4"/>
+            </w:tcBorders>
+            <w:tcMar>
+              <w:top w:type="dxa" w:w="60"/>
+              <w:left w:type="dxa" w:w="100"/>
+              <w:bottom w:type="dxa" w:w="60"/>
+              <w:right w:type="dxa" w:w="100"/>
+            </w:tcMar>
+          </w:tcPr>
+          <w:p>
+            <w:pPr>
+              <w:spacing w:after="0"/>
+            </w:pPr>
+            <w:r>
+              <w:rPr>
+                <w:b w:val="false"/>
+                <w:bCs w:val="false"/>
+                <w:sz w:val="19"/>
+                <w:szCs w:val="19"/>
+              </w:rPr>
+              <w:t xml:space="preserve">Local Lighthouse/axe: 23 October 2026 (reports/audit-summary.json). Hosted WAVE/WebPageTest: 22–23 October 2026 UTC (reports/hosted-tests.json)</w:t>
             </w:r>
           </w:p>
         </w:tc>
@@ -1471,6 +1535,196 @@
                 <w:sz w:val="19"/>
                 <w:szCs w:val="19"/>
               </w:rPr>
+              <w:t xml:space="preserve">WAVE (wave.webaim.org)</w:t>
+            </w:r>
+          </w:p>
+        </w:tc>
+        <w:tc>
+          <w:tcPr>
+            <w:tcW w:type="dxa" w:w="1600"/>
+            <w:tcBorders>
+              <w:top w:val="single" w:color="BFBFBF" w:sz="4"/>
+              <w:left w:val="single" w:color="BFBFBF" w:sz="4"/>
+              <w:bottom w:val="single" w:color="BFBFBF" w:sz="4"/>
+              <w:right w:val="single" w:color="BFBFBF" w:sz="4"/>
+            </w:tcBorders>
+            <w:tcMar>
+              <w:top w:type="dxa" w:w="60"/>
+              <w:left w:type="dxa" w:w="100"/>
+              <w:bottom w:type="dxa" w:w="60"/>
+              <w:right w:type="dxa" w:w="100"/>
+            </w:tcMar>
+          </w:tcPr>
+          <w:p>
+            <w:pPr>
+              <w:spacing w:after="0"/>
+            </w:pPr>
+            <w:r>
+              <w:rPr>
+                <w:b w:val="false"/>
+                <w:bCs w:val="false"/>
+                <w:sz w:val="19"/>
+                <w:szCs w:val="19"/>
+              </w:rPr>
+              <w:t xml:space="preserve">web interface</w:t>
+            </w:r>
+          </w:p>
+        </w:tc>
+        <w:tc>
+          <w:tcPr>
+            <w:tcW w:type="dxa" w:w="5126"/>
+            <w:tcBorders>
+              <w:top w:val="single" w:color="BFBFBF" w:sz="4"/>
+              <w:left w:val="single" w:color="BFBFBF" w:sz="4"/>
+              <w:bottom w:val="single" w:color="BFBFBF" w:sz="4"/>
+              <w:right w:val="single" w:color="BFBFBF" w:sz="4"/>
+            </w:tcBorders>
+            <w:tcMar>
+              <w:top w:type="dxa" w:w="60"/>
+              <w:left w:type="dxa" w:w="100"/>
+              <w:bottom w:type="dxa" w:w="60"/>
+              <w:right w:type="dxa" w:w="100"/>
+            </w:tcMar>
+          </w:tcPr>
+          <w:p>
+            <w:pPr>
+              <w:spacing w:after="0"/>
+            </w:pPr>
+            <w:r>
+              <w:rPr>
+                <w:b w:val="false"/>
+                <w:bCs w:val="false"/>
+                <w:sz w:val="19"/>
+                <w:szCs w:val="19"/>
+              </w:rPr>
+              <w:t xml:space="preserve">Accessibility evaluation of the hosted pages: errors, contrast errors, alerts, structure</w:t>
+            </w:r>
+          </w:p>
+        </w:tc>
+      </w:tr>
+      <w:tr>
+        <w:tc>
+          <w:tcPr>
+            <w:tcW w:type="dxa" w:w="2300"/>
+            <w:tcBorders>
+              <w:top w:val="single" w:color="BFBFBF" w:sz="4"/>
+              <w:left w:val="single" w:color="BFBFBF" w:sz="4"/>
+              <w:bottom w:val="single" w:color="BFBFBF" w:sz="4"/>
+              <w:right w:val="single" w:color="BFBFBF" w:sz="4"/>
+            </w:tcBorders>
+            <w:tcMar>
+              <w:top w:type="dxa" w:w="60"/>
+              <w:left w:type="dxa" w:w="100"/>
+              <w:bottom w:type="dxa" w:w="60"/>
+              <w:right w:type="dxa" w:w="100"/>
+            </w:tcMar>
+          </w:tcPr>
+          <w:p>
+            <w:pPr>
+              <w:spacing w:after="0"/>
+            </w:pPr>
+            <w:r>
+              <w:rPr>
+                <w:b w:val="false"/>
+                <w:bCs w:val="false"/>
+                <w:sz w:val="19"/>
+                <w:szCs w:val="19"/>
+              </w:rPr>
+              <w:t xml:space="preserve">WebPageTest (webpagetest.org)</w:t>
+            </w:r>
+          </w:p>
+        </w:tc>
+        <w:tc>
+          <w:tcPr>
+            <w:tcW w:type="dxa" w:w="1600"/>
+            <w:tcBorders>
+              <w:top w:val="single" w:color="BFBFBF" w:sz="4"/>
+              <w:left w:val="single" w:color="BFBFBF" w:sz="4"/>
+              <w:bottom w:val="single" w:color="BFBFBF" w:sz="4"/>
+              <w:right w:val="single" w:color="BFBFBF" w:sz="4"/>
+            </w:tcBorders>
+            <w:tcMar>
+              <w:top w:type="dxa" w:w="60"/>
+              <w:left w:type="dxa" w:w="100"/>
+              <w:bottom w:type="dxa" w:w="60"/>
+              <w:right w:type="dxa" w:w="100"/>
+            </w:tcMar>
+          </w:tcPr>
+          <w:p>
+            <w:pPr>
+              <w:spacing w:after="0"/>
+            </w:pPr>
+            <w:r>
+              <w:rPr>
+                <w:b w:val="false"/>
+                <w:bCs w:val="false"/>
+                <w:sz w:val="19"/>
+                <w:szCs w:val="19"/>
+              </w:rPr>
+              <w:t xml:space="preserve">anonymous test, Chrome 152</w:t>
+            </w:r>
+          </w:p>
+        </w:tc>
+        <w:tc>
+          <w:tcPr>
+            <w:tcW w:type="dxa" w:w="5126"/>
+            <w:tcBorders>
+              <w:top w:val="single" w:color="BFBFBF" w:sz="4"/>
+              <w:left w:val="single" w:color="BFBFBF" w:sz="4"/>
+              <w:bottom w:val="single" w:color="BFBFBF" w:sz="4"/>
+              <w:right w:val="single" w:color="BFBFBF" w:sz="4"/>
+            </w:tcBorders>
+            <w:tcMar>
+              <w:top w:type="dxa" w:w="60"/>
+              <w:left w:type="dxa" w:w="100"/>
+              <w:bottom w:type="dxa" w:w="60"/>
+              <w:right w:type="dxa" w:w="100"/>
+            </w:tcMar>
+          </w:tcPr>
+          <w:p>
+            <w:pPr>
+              <w:spacing w:after="0"/>
+            </w:pPr>
+            <w:r>
+              <w:rPr>
+                <w:b w:val="false"/>
+                <w:bCs w:val="false"/>
+                <w:sz w:val="19"/>
+                <w:szCs w:val="19"/>
+              </w:rPr>
+              <w:t xml:space="preserve">Real-network page loads of the hosted pages from Singapore (mobile, 4G) and Tokyo (desktop, WiFi)</w:t>
+            </w:r>
+          </w:p>
+        </w:tc>
+      </w:tr>
+      <w:tr>
+        <w:tc>
+          <w:tcPr>
+            <w:tcW w:type="dxa" w:w="2300"/>
+            <w:tcBorders>
+              <w:top w:val="single" w:color="BFBFBF" w:sz="4"/>
+              <w:left w:val="single" w:color="BFBFBF" w:sz="4"/>
+              <w:bottom w:val="single" w:color="BFBFBF" w:sz="4"/>
+              <w:right w:val="single" w:color="BFBFBF" w:sz="4"/>
+            </w:tcBorders>
+            <w:tcMar>
+              <w:top w:type="dxa" w:w="60"/>
+              <w:left w:type="dxa" w:w="100"/>
+              <w:bottom w:type="dxa" w:w="60"/>
+              <w:right w:type="dxa" w:w="100"/>
+            </w:tcMar>
+          </w:tcPr>
+          <w:p>
+            <w:pPr>
+              <w:spacing w:after="0"/>
+            </w:pPr>
+            <w:r>
+              <w:rPr>
+                <w:b w:val="false"/>
+                <w:bCs w:val="false"/>
+                <w:sz w:val="19"/>
+                <w:szCs w:val="19"/>
+              </w:rPr>
               <w:t xml:space="preserve">esbuild</w:t>
             </w:r>
           </w:p>
@@ -1549,7 +1803,7 @@
         <w:spacing w:after="160" w:line="288"/>
       </w:pPr>
       <w:r>
-        <w:t xml:space="preserve">WAVE and WebPageTest were not used. Both need the page to be publicly reachable on the internet, and this project was only served locally. Section 11 explains how to run them once the page is published (for example on GitHub Pages).</w:t>
+        <w:t xml:space="preserve">Lighthouse, axe and the validators ran locally. WAVE and WebPageTest need a public URL, so both versions were published with GitHub Pages and tested there (Section 9.3).</w:t>
       </w:r>
     </w:p>
     <w:p>
@@ -6825,6 +7079,26 @@
     </w:p>
     <w:p>
       <w:pPr>
+        <w:pStyle w:val="ListParagraph"/>
+        <w:numPr>
+          <w:ilvl w:val="0"/>
+          <w:numId w:val="2"/>
+        </w:numPr>
+        <w:spacing w:after="80" w:line="276"/>
+      </w:pPr>
+      <w:r>
+        <w:rPr>
+          <w:b/>
+          <w:bCs/>
+        </w:rPr>
+        <w:t xml:space="preserve">Hosted tests:</w:t>
+      </w:r>
+      <w:r>
+        <w:t xml:space="preserve"> the repository was published with GitHub Pages (built from commit 9e98b41; text files served gzipped with cache-control: max-age=600). WAVE’s web interface evaluated both URLs. WebPageTest’s anonymous test, which allows one run per test, loaded each page on two profiles: iPhone 15 on 4G (9 Mbps, 170 ms RTT) from Singapore, and desktop on WiFi from Tokyo.</w:t>
+      </w:r>
+    </w:p>
+    <w:p>
+      <w:pPr>
         <w:pBdr>
           <w:left w:val="single" w:color="1F4E79" w:sz="18" w:space="8"/>
         </w:pBdr>
@@ -6833,7 +7107,7 @@
         <w:ind w:left="240" w:right="240"/>
       </w:pPr>
       <w:r>
-        <w:t xml:space="preserve">Lab results from a local server measure the page itself, not a real network. Real-world numbers on a hosted site will differ (CDN, cache, real devices), so the comparison between the two versions matters more than the absolute values.</w:t>
+        <w:t xml:space="preserve">The local Lighthouse runs measure the page itself under simulated throttling; the WebPageTest runs add a real host and real network. Neither is field data from real visitors, so the comparison between the two versions matters more than the absolute values.</w:t>
       </w:r>
     </w:p>
     <w:p>
@@ -9542,6 +9816,2598 @@
     </w:p>
     <w:p>
       <w:pPr>
+        <w:pStyle w:val="Heading2"/>
+      </w:pPr>
+      <w:r>
+        <w:t xml:space="preserve">9.3 Hosted tests: WAVE and WebPageTest</w:t>
+      </w:r>
+    </w:p>
+    <w:p>
+      <w:pPr>
+        <w:spacing w:after="160" w:line="288"/>
+      </w:pPr>
+      <w:r>
+        <w:t xml:space="preserve">Both versions were tested on GitHub Pages: https://takshaksinghania.github.io/frontend-internship-week4-performance-accessibility/ and the same address with /baseline/. Raw numbers and links to the public result pages are in reports/hosted-tests.json.</w:t>
+      </w:r>
+    </w:p>
+    <w:p>
+      <w:pPr>
+        <w:pStyle w:val="Heading3"/>
+      </w:pPr>
+      <w:r>
+        <w:t xml:space="preserve">WAVE</w:t>
+      </w:r>
+    </w:p>
+    <w:tbl>
+      <w:tblPr>
+        <w:tblW w:type="dxa" w:w="9026"/>
+        <w:tblBorders>
+          <w:top w:val="single" w:color="auto" w:sz="4"/>
+          <w:left w:val="single" w:color="auto" w:sz="4"/>
+          <w:bottom w:val="single" w:color="auto" w:sz="4"/>
+          <w:right w:val="single" w:color="auto" w:sz="4"/>
+          <w:insideH w:val="single" w:color="auto" w:sz="4"/>
+          <w:insideV w:val="single" w:color="auto" w:sz="4"/>
+        </w:tblBorders>
+        <w:tblLayout w:type="fixed"/>
+      </w:tblPr>
+      <w:tblGrid>
+        <w:gridCol w:w="3226"/>
+        <w:gridCol w:w="2900"/>
+        <w:gridCol w:w="2900"/>
+      </w:tblGrid>
+      <w:tr>
+        <w:trPr>
+          <w:tblHeader/>
+        </w:trPr>
+        <w:tc>
+          <w:tcPr>
+            <w:tcW w:type="dxa" w:w="3226"/>
+            <w:tcBorders>
+              <w:top w:val="single" w:color="BFBFBF" w:sz="4"/>
+              <w:left w:val="single" w:color="BFBFBF" w:sz="4"/>
+              <w:bottom w:val="single" w:color="BFBFBF" w:sz="4"/>
+              <w:right w:val="single" w:color="BFBFBF" w:sz="4"/>
+            </w:tcBorders>
+            <w:shd w:fill="DCE6F1" w:color="auto" w:val="clear"/>
+            <w:tcMar>
+              <w:top w:type="dxa" w:w="60"/>
+              <w:left w:type="dxa" w:w="100"/>
+              <w:bottom w:type="dxa" w:w="60"/>
+              <w:right w:type="dxa" w:w="100"/>
+            </w:tcMar>
+          </w:tcPr>
+          <w:p>
+            <w:pPr>
+              <w:spacing w:after="0"/>
+            </w:pPr>
+            <w:r>
+              <w:rPr>
+                <w:b/>
+                <w:bCs/>
+                <w:sz w:val="19"/>
+                <w:szCs w:val="19"/>
+              </w:rPr>
+              <w:t xml:space="preserve">WAVE result</w:t>
+            </w:r>
+          </w:p>
+        </w:tc>
+        <w:tc>
+          <w:tcPr>
+            <w:tcW w:type="dxa" w:w="2900"/>
+            <w:tcBorders>
+              <w:top w:val="single" w:color="BFBFBF" w:sz="4"/>
+              <w:left w:val="single" w:color="BFBFBF" w:sz="4"/>
+              <w:bottom w:val="single" w:color="BFBFBF" w:sz="4"/>
+              <w:right w:val="single" w:color="BFBFBF" w:sz="4"/>
+            </w:tcBorders>
+            <w:shd w:fill="DCE6F1" w:color="auto" w:val="clear"/>
+            <w:tcMar>
+              <w:top w:type="dxa" w:w="60"/>
+              <w:left w:type="dxa" w:w="100"/>
+              <w:bottom w:type="dxa" w:w="60"/>
+              <w:right w:type="dxa" w:w="100"/>
+            </w:tcMar>
+          </w:tcPr>
+          <w:p>
+            <w:pPr>
+              <w:spacing w:after="0"/>
+            </w:pPr>
+            <w:r>
+              <w:rPr>
+                <w:b/>
+                <w:bCs/>
+                <w:sz w:val="19"/>
+                <w:szCs w:val="19"/>
+              </w:rPr>
+              <w:t xml:space="preserve">Baseline</w:t>
+            </w:r>
+          </w:p>
+        </w:tc>
+        <w:tc>
+          <w:tcPr>
+            <w:tcW w:type="dxa" w:w="2900"/>
+            <w:tcBorders>
+              <w:top w:val="single" w:color="BFBFBF" w:sz="4"/>
+              <w:left w:val="single" w:color="BFBFBF" w:sz="4"/>
+              <w:bottom w:val="single" w:color="BFBFBF" w:sz="4"/>
+              <w:right w:val="single" w:color="BFBFBF" w:sz="4"/>
+            </w:tcBorders>
+            <w:shd w:fill="DCE6F1" w:color="auto" w:val="clear"/>
+            <w:tcMar>
+              <w:top w:type="dxa" w:w="60"/>
+              <w:left w:type="dxa" w:w="100"/>
+              <w:bottom w:type="dxa" w:w="60"/>
+              <w:right w:type="dxa" w:w="100"/>
+            </w:tcMar>
+          </w:tcPr>
+          <w:p>
+            <w:pPr>
+              <w:spacing w:after="0"/>
+            </w:pPr>
+            <w:r>
+              <w:rPr>
+                <w:b/>
+                <w:bCs/>
+                <w:sz w:val="19"/>
+                <w:szCs w:val="19"/>
+              </w:rPr>
+              <w:t xml:space="preserve">Optimised</w:t>
+            </w:r>
+          </w:p>
+        </w:tc>
+      </w:tr>
+      <w:tr>
+        <w:tc>
+          <w:tcPr>
+            <w:tcW w:type="dxa" w:w="3226"/>
+            <w:tcBorders>
+              <w:top w:val="single" w:color="BFBFBF" w:sz="4"/>
+              <w:left w:val="single" w:color="BFBFBF" w:sz="4"/>
+              <w:bottom w:val="single" w:color="BFBFBF" w:sz="4"/>
+              <w:right w:val="single" w:color="BFBFBF" w:sz="4"/>
+            </w:tcBorders>
+            <w:tcMar>
+              <w:top w:type="dxa" w:w="60"/>
+              <w:left w:type="dxa" w:w="100"/>
+              <w:bottom w:type="dxa" w:w="60"/>
+              <w:right w:type="dxa" w:w="100"/>
+            </w:tcMar>
+          </w:tcPr>
+          <w:p>
+            <w:pPr>
+              <w:spacing w:after="0"/>
+            </w:pPr>
+            <w:r>
+              <w:rPr>
+                <w:b w:val="false"/>
+                <w:bCs w:val="false"/>
+                <w:sz w:val="19"/>
+                <w:szCs w:val="19"/>
+              </w:rPr>
+              <w:t xml:space="preserve">Errors</w:t>
+            </w:r>
+          </w:p>
+        </w:tc>
+        <w:tc>
+          <w:tcPr>
+            <w:tcW w:type="dxa" w:w="2900"/>
+            <w:tcBorders>
+              <w:top w:val="single" w:color="BFBFBF" w:sz="4"/>
+              <w:left w:val="single" w:color="BFBFBF" w:sz="4"/>
+              <w:bottom w:val="single" w:color="BFBFBF" w:sz="4"/>
+              <w:right w:val="single" w:color="BFBFBF" w:sz="4"/>
+            </w:tcBorders>
+            <w:tcMar>
+              <w:top w:type="dxa" w:w="60"/>
+              <w:left w:type="dxa" w:w="100"/>
+              <w:bottom w:type="dxa" w:w="60"/>
+              <w:right w:type="dxa" w:w="100"/>
+            </w:tcMar>
+          </w:tcPr>
+          <w:p>
+            <w:pPr>
+              <w:spacing w:after="0"/>
+            </w:pPr>
+            <w:r>
+              <w:rPr>
+                <w:b w:val="false"/>
+                <w:bCs w:val="false"/>
+                <w:sz w:val="19"/>
+                <w:szCs w:val="19"/>
+              </w:rPr>
+              <w:t xml:space="preserve">7 (missing alt 1, missing form label 5, language missing 1)</w:t>
+            </w:r>
+          </w:p>
+        </w:tc>
+        <w:tc>
+          <w:tcPr>
+            <w:tcW w:type="dxa" w:w="2900"/>
+            <w:tcBorders>
+              <w:top w:val="single" w:color="BFBFBF" w:sz="4"/>
+              <w:left w:val="single" w:color="BFBFBF" w:sz="4"/>
+              <w:bottom w:val="single" w:color="BFBFBF" w:sz="4"/>
+              <w:right w:val="single" w:color="BFBFBF" w:sz="4"/>
+            </w:tcBorders>
+            <w:tcMar>
+              <w:top w:type="dxa" w:w="60"/>
+              <w:left w:type="dxa" w:w="100"/>
+              <w:bottom w:type="dxa" w:w="60"/>
+              <w:right w:type="dxa" w:w="100"/>
+            </w:tcMar>
+          </w:tcPr>
+          <w:p>
+            <w:pPr>
+              <w:spacing w:after="0"/>
+            </w:pPr>
+            <w:r>
+              <w:rPr>
+                <w:b w:val="false"/>
+                <w:bCs w:val="false"/>
+                <w:sz w:val="19"/>
+                <w:szCs w:val="19"/>
+              </w:rPr>
+              <w:t xml:space="preserve">0</w:t>
+            </w:r>
+          </w:p>
+        </w:tc>
+      </w:tr>
+      <w:tr>
+        <w:tc>
+          <w:tcPr>
+            <w:tcW w:type="dxa" w:w="3226"/>
+            <w:tcBorders>
+              <w:top w:val="single" w:color="BFBFBF" w:sz="4"/>
+              <w:left w:val="single" w:color="BFBFBF" w:sz="4"/>
+              <w:bottom w:val="single" w:color="BFBFBF" w:sz="4"/>
+              <w:right w:val="single" w:color="BFBFBF" w:sz="4"/>
+            </w:tcBorders>
+            <w:tcMar>
+              <w:top w:type="dxa" w:w="60"/>
+              <w:left w:type="dxa" w:w="100"/>
+              <w:bottom w:type="dxa" w:w="60"/>
+              <w:right w:type="dxa" w:w="100"/>
+            </w:tcMar>
+          </w:tcPr>
+          <w:p>
+            <w:pPr>
+              <w:spacing w:after="0"/>
+            </w:pPr>
+            <w:r>
+              <w:rPr>
+                <w:b w:val="false"/>
+                <w:bCs w:val="false"/>
+                <w:sz w:val="19"/>
+                <w:szCs w:val="19"/>
+              </w:rPr>
+              <w:t xml:space="preserve">Contrast errors</w:t>
+            </w:r>
+          </w:p>
+        </w:tc>
+        <w:tc>
+          <w:tcPr>
+            <w:tcW w:type="dxa" w:w="2900"/>
+            <w:tcBorders>
+              <w:top w:val="single" w:color="BFBFBF" w:sz="4"/>
+              <w:left w:val="single" w:color="BFBFBF" w:sz="4"/>
+              <w:bottom w:val="single" w:color="BFBFBF" w:sz="4"/>
+              <w:right w:val="single" w:color="BFBFBF" w:sz="4"/>
+            </w:tcBorders>
+            <w:tcMar>
+              <w:top w:type="dxa" w:w="60"/>
+              <w:left w:type="dxa" w:w="100"/>
+              <w:bottom w:type="dxa" w:w="60"/>
+              <w:right w:type="dxa" w:w="100"/>
+            </w:tcMar>
+          </w:tcPr>
+          <w:p>
+            <w:pPr>
+              <w:spacing w:after="0"/>
+            </w:pPr>
+            <w:r>
+              <w:rPr>
+                <w:b w:val="false"/>
+                <w:bCs w:val="false"/>
+                <w:sz w:val="19"/>
+                <w:szCs w:val="19"/>
+              </w:rPr>
+              <w:t xml:space="preserve">32</w:t>
+            </w:r>
+          </w:p>
+        </w:tc>
+        <w:tc>
+          <w:tcPr>
+            <w:tcW w:type="dxa" w:w="2900"/>
+            <w:tcBorders>
+              <w:top w:val="single" w:color="BFBFBF" w:sz="4"/>
+              <w:left w:val="single" w:color="BFBFBF" w:sz="4"/>
+              <w:bottom w:val="single" w:color="BFBFBF" w:sz="4"/>
+              <w:right w:val="single" w:color="BFBFBF" w:sz="4"/>
+            </w:tcBorders>
+            <w:tcMar>
+              <w:top w:type="dxa" w:w="60"/>
+              <w:left w:type="dxa" w:w="100"/>
+              <w:bottom w:type="dxa" w:w="60"/>
+              <w:right w:type="dxa" w:w="100"/>
+            </w:tcMar>
+          </w:tcPr>
+          <w:p>
+            <w:pPr>
+              <w:spacing w:after="0"/>
+            </w:pPr>
+            <w:r>
+              <w:rPr>
+                <w:b w:val="false"/>
+                <w:bCs w:val="false"/>
+                <w:sz w:val="19"/>
+                <w:szCs w:val="19"/>
+              </w:rPr>
+              <w:t xml:space="preserve">0</w:t>
+            </w:r>
+          </w:p>
+        </w:tc>
+      </w:tr>
+      <w:tr>
+        <w:tc>
+          <w:tcPr>
+            <w:tcW w:type="dxa" w:w="3226"/>
+            <w:tcBorders>
+              <w:top w:val="single" w:color="BFBFBF" w:sz="4"/>
+              <w:left w:val="single" w:color="BFBFBF" w:sz="4"/>
+              <w:bottom w:val="single" w:color="BFBFBF" w:sz="4"/>
+              <w:right w:val="single" w:color="BFBFBF" w:sz="4"/>
+            </w:tcBorders>
+            <w:tcMar>
+              <w:top w:type="dxa" w:w="60"/>
+              <w:left w:type="dxa" w:w="100"/>
+              <w:bottom w:type="dxa" w:w="60"/>
+              <w:right w:type="dxa" w:w="100"/>
+            </w:tcMar>
+          </w:tcPr>
+          <w:p>
+            <w:pPr>
+              <w:spacing w:after="0"/>
+            </w:pPr>
+            <w:r>
+              <w:rPr>
+                <w:b w:val="false"/>
+                <w:bCs w:val="false"/>
+                <w:sz w:val="19"/>
+                <w:szCs w:val="19"/>
+              </w:rPr>
+              <w:t xml:space="preserve">Alerts</w:t>
+            </w:r>
+          </w:p>
+        </w:tc>
+        <w:tc>
+          <w:tcPr>
+            <w:tcW w:type="dxa" w:w="2900"/>
+            <w:tcBorders>
+              <w:top w:val="single" w:color="BFBFBF" w:sz="4"/>
+              <w:left w:val="single" w:color="BFBFBF" w:sz="4"/>
+              <w:bottom w:val="single" w:color="BFBFBF" w:sz="4"/>
+              <w:right w:val="single" w:color="BFBFBF" w:sz="4"/>
+            </w:tcBorders>
+            <w:tcMar>
+              <w:top w:type="dxa" w:w="60"/>
+              <w:left w:type="dxa" w:w="100"/>
+              <w:bottom w:type="dxa" w:w="60"/>
+              <w:right w:type="dxa" w:w="100"/>
+            </w:tcMar>
+          </w:tcPr>
+          <w:p>
+            <w:pPr>
+              <w:spacing w:after="0"/>
+            </w:pPr>
+            <w:r>
+              <w:rPr>
+                <w:b w:val="false"/>
+                <w:bCs w:val="false"/>
+                <w:sz w:val="19"/>
+                <w:szCs w:val="19"/>
+              </w:rPr>
+              <w:t xml:space="preserve">15</w:t>
+            </w:r>
+          </w:p>
+        </w:tc>
+        <w:tc>
+          <w:tcPr>
+            <w:tcW w:type="dxa" w:w="2900"/>
+            <w:tcBorders>
+              <w:top w:val="single" w:color="BFBFBF" w:sz="4"/>
+              <w:left w:val="single" w:color="BFBFBF" w:sz="4"/>
+              <w:bottom w:val="single" w:color="BFBFBF" w:sz="4"/>
+              <w:right w:val="single" w:color="BFBFBF" w:sz="4"/>
+            </w:tcBorders>
+            <w:tcMar>
+              <w:top w:type="dxa" w:w="60"/>
+              <w:left w:type="dxa" w:w="100"/>
+              <w:bottom w:type="dxa" w:w="60"/>
+              <w:right w:type="dxa" w:w="100"/>
+            </w:tcMar>
+          </w:tcPr>
+          <w:p>
+            <w:pPr>
+              <w:spacing w:after="0"/>
+            </w:pPr>
+            <w:r>
+              <w:rPr>
+                <w:b w:val="false"/>
+                <w:bCs w:val="false"/>
+                <w:sz w:val="19"/>
+                <w:szCs w:val="19"/>
+              </w:rPr>
+              <w:t xml:space="preserve">3</w:t>
+            </w:r>
+          </w:p>
+        </w:tc>
+      </w:tr>
+      <w:tr>
+        <w:tc>
+          <w:tcPr>
+            <w:tcW w:type="dxa" w:w="3226"/>
+            <w:tcBorders>
+              <w:top w:val="single" w:color="BFBFBF" w:sz="4"/>
+              <w:left w:val="single" w:color="BFBFBF" w:sz="4"/>
+              <w:bottom w:val="single" w:color="BFBFBF" w:sz="4"/>
+              <w:right w:val="single" w:color="BFBFBF" w:sz="4"/>
+            </w:tcBorders>
+            <w:tcMar>
+              <w:top w:type="dxa" w:w="60"/>
+              <w:left w:type="dxa" w:w="100"/>
+              <w:bottom w:type="dxa" w:w="60"/>
+              <w:right w:type="dxa" w:w="100"/>
+            </w:tcMar>
+          </w:tcPr>
+          <w:p>
+            <w:pPr>
+              <w:spacing w:after="0"/>
+            </w:pPr>
+            <w:r>
+              <w:rPr>
+                <w:b w:val="false"/>
+                <w:bCs w:val="false"/>
+                <w:sz w:val="19"/>
+                <w:szCs w:val="19"/>
+              </w:rPr>
+              <w:t xml:space="preserve">Features / structural elements / ARIA</w:t>
+            </w:r>
+          </w:p>
+        </w:tc>
+        <w:tc>
+          <w:tcPr>
+            <w:tcW w:type="dxa" w:w="2900"/>
+            <w:tcBorders>
+              <w:top w:val="single" w:color="BFBFBF" w:sz="4"/>
+              <w:left w:val="single" w:color="BFBFBF" w:sz="4"/>
+              <w:bottom w:val="single" w:color="BFBFBF" w:sz="4"/>
+              <w:right w:val="single" w:color="BFBFBF" w:sz="4"/>
+            </w:tcBorders>
+            <w:tcMar>
+              <w:top w:type="dxa" w:w="60"/>
+              <w:left w:type="dxa" w:w="100"/>
+              <w:bottom w:type="dxa" w:w="60"/>
+              <w:right w:type="dxa" w:w="100"/>
+            </w:tcMar>
+          </w:tcPr>
+          <w:p>
+            <w:pPr>
+              <w:spacing w:after="0"/>
+            </w:pPr>
+            <w:r>
+              <w:rPr>
+                <w:b w:val="false"/>
+                <w:bCs w:val="false"/>
+                <w:sz w:val="19"/>
+                <w:szCs w:val="19"/>
+              </w:rPr>
+              <w:t xml:space="preserve">0 / 7 / 0</w:t>
+            </w:r>
+          </w:p>
+        </w:tc>
+        <w:tc>
+          <w:tcPr>
+            <w:tcW w:type="dxa" w:w="2900"/>
+            <w:tcBorders>
+              <w:top w:val="single" w:color="BFBFBF" w:sz="4"/>
+              <w:left w:val="single" w:color="BFBFBF" w:sz="4"/>
+              <w:bottom w:val="single" w:color="BFBFBF" w:sz="4"/>
+              <w:right w:val="single" w:color="BFBFBF" w:sz="4"/>
+            </w:tcBorders>
+            <w:tcMar>
+              <w:top w:type="dxa" w:w="60"/>
+              <w:left w:type="dxa" w:w="100"/>
+              <w:bottom w:type="dxa" w:w="60"/>
+              <w:right w:type="dxa" w:w="100"/>
+            </w:tcMar>
+          </w:tcPr>
+          <w:p>
+            <w:pPr>
+              <w:spacing w:after="0"/>
+            </w:pPr>
+            <w:r>
+              <w:rPr>
+                <w:b w:val="false"/>
+                <w:bCs w:val="false"/>
+                <w:sz w:val="19"/>
+                <w:szCs w:val="19"/>
+              </w:rPr>
+              <w:t xml:space="preserve">16 / 32 / 15</w:t>
+            </w:r>
+          </w:p>
+        </w:tc>
+      </w:tr>
+      <w:tr>
+        <w:tc>
+          <w:tcPr>
+            <w:tcW w:type="dxa" w:w="3226"/>
+            <w:tcBorders>
+              <w:top w:val="single" w:color="BFBFBF" w:sz="4"/>
+              <w:left w:val="single" w:color="BFBFBF" w:sz="4"/>
+              <w:bottom w:val="single" w:color="BFBFBF" w:sz="4"/>
+              <w:right w:val="single" w:color="BFBFBF" w:sz="4"/>
+            </w:tcBorders>
+            <w:tcMar>
+              <w:top w:type="dxa" w:w="60"/>
+              <w:left w:type="dxa" w:w="100"/>
+              <w:bottom w:type="dxa" w:w="60"/>
+              <w:right w:type="dxa" w:w="100"/>
+            </w:tcMar>
+          </w:tcPr>
+          <w:p>
+            <w:pPr>
+              <w:spacing w:after="0"/>
+            </w:pPr>
+            <w:r>
+              <w:rPr>
+                <w:b w:val="false"/>
+                <w:bCs w:val="false"/>
+                <w:sz w:val="19"/>
+                <w:szCs w:val="19"/>
+              </w:rPr>
+              <w:t xml:space="preserve">AIM score</w:t>
+            </w:r>
+          </w:p>
+        </w:tc>
+        <w:tc>
+          <w:tcPr>
+            <w:tcW w:type="dxa" w:w="2900"/>
+            <w:tcBorders>
+              <w:top w:val="single" w:color="BFBFBF" w:sz="4"/>
+              <w:left w:val="single" w:color="BFBFBF" w:sz="4"/>
+              <w:bottom w:val="single" w:color="BFBFBF" w:sz="4"/>
+              <w:right w:val="single" w:color="BFBFBF" w:sz="4"/>
+            </w:tcBorders>
+            <w:tcMar>
+              <w:top w:type="dxa" w:w="60"/>
+              <w:left w:type="dxa" w:w="100"/>
+              <w:bottom w:type="dxa" w:w="60"/>
+              <w:right w:type="dxa" w:w="100"/>
+            </w:tcMar>
+          </w:tcPr>
+          <w:p>
+            <w:pPr>
+              <w:spacing w:after="0"/>
+            </w:pPr>
+            <w:r>
+              <w:rPr>
+                <w:b w:val="false"/>
+                <w:bCs w:val="false"/>
+                <w:sz w:val="19"/>
+                <w:szCs w:val="19"/>
+              </w:rPr>
+              <w:t xml:space="preserve">3.4 / 10</w:t>
+            </w:r>
+          </w:p>
+        </w:tc>
+        <w:tc>
+          <w:tcPr>
+            <w:tcW w:type="dxa" w:w="2900"/>
+            <w:tcBorders>
+              <w:top w:val="single" w:color="BFBFBF" w:sz="4"/>
+              <w:left w:val="single" w:color="BFBFBF" w:sz="4"/>
+              <w:bottom w:val="single" w:color="BFBFBF" w:sz="4"/>
+              <w:right w:val="single" w:color="BFBFBF" w:sz="4"/>
+            </w:tcBorders>
+            <w:tcMar>
+              <w:top w:type="dxa" w:w="60"/>
+              <w:left w:type="dxa" w:w="100"/>
+              <w:bottom w:type="dxa" w:w="60"/>
+              <w:right w:type="dxa" w:w="100"/>
+            </w:tcMar>
+          </w:tcPr>
+          <w:p>
+            <w:pPr>
+              <w:spacing w:after="0"/>
+            </w:pPr>
+            <w:r>
+              <w:rPr>
+                <w:b w:val="false"/>
+                <w:bCs w:val="false"/>
+                <w:sz w:val="19"/>
+                <w:szCs w:val="19"/>
+              </w:rPr>
+              <w:t xml:space="preserve">10 / 10</w:t>
+            </w:r>
+          </w:p>
+        </w:tc>
+      </w:tr>
+    </w:tbl>
+    <w:p>
+      <w:pPr>
+        <w:spacing w:after="160"/>
+      </w:pPr>
+    </w:p>
+    <w:p>
+      <w:pPr>
+        <w:spacing w:after="160" w:line="288"/>
+      </w:pPr>
+      <w:r>
+        <w:t xml:space="preserve">The baseline’s 15 alerts were: select missing label, suspicious alternative text (×3), nearby image with the same alternative text (×2), no page regions, skipped heading level, suspicious link text (×4), redundant link (×2) and a layout table. The optimised page’s 3 alerts were reviewed one by one. “Long alternative text” is the location map, kept long on purpose because it is the only informative image. “Possible heading” is the bold opening-status line, which is a status message and correctly stays a paragraph. “Noscript element” is the intended fallback notice for the sign-up form.</w:t>
+      </w:r>
+    </w:p>
+    <w:p>
+      <w:pPr>
+        <w:spacing w:after="60" w:before="120"/>
+        <w:jc w:val="center"/>
+      </w:pPr>
+      <w:r>
+        <w:drawing>
+          <wp:inline distT="0" distB="0" distL="0" distR="0">
+            <wp:extent cx="2667000" cy="3409950"/>
+            <wp:effectExtent t="0" r="0" b="0" l="0"/>
+            <wp:docPr id="7" name="figure" descr="Figure 7 — WAVE summary for the hosted baseline." title="Figure 7 — WAVE summary for the hosted baseline."/>
+            <wp:cNvGraphicFramePr>
+              <a:graphicFrameLocks xmlns:a="http://schemas.openxmlformats.org/drawingml/2006/main" noChangeAspect="1"/>
+            </wp:cNvGraphicFramePr>
+            <a:graphic xmlns:a="http://schemas.openxmlformats.org/drawingml/2006/main">
+              <a:graphicData uri="http://schemas.openxmlformats.org/drawingml/2006/picture">
+                <pic:pic xmlns:pic="http://schemas.openxmlformats.org/drawingml/2006/picture">
+                  <pic:nvPicPr>
+                    <pic:cNvPr id="0" name="" descr=""/>
+                    <pic:cNvPicPr>
+                      <a:picLocks noChangeAspect="1" noChangeArrowheads="1"/>
+                    </pic:cNvPicPr>
+                  </pic:nvPicPr>
+                  <pic:blipFill>
+                    <a:blip r:embed="rId15" cstate="none"/>
+                    <a:srcRect/>
+                    <a:stretch>
+                      <a:fillRect/>
+                    </a:stretch>
+                  </pic:blipFill>
+                  <pic:spPr bwMode="auto">
+                    <a:xfrm>
+                      <a:off x="0" y="0"/>
+                      <a:ext cx="2667000" cy="3409950"/>
+                    </a:xfrm>
+                    <a:prstGeom prst="rect">
+                      <a:avLst/>
+                    </a:prstGeom>
+                  </pic:spPr>
+                </pic:pic>
+              </a:graphicData>
+            </a:graphic>
+          </wp:inline>
+        </w:drawing>
+      </w:r>
+    </w:p>
+    <w:p>
+      <w:pPr>
+        <w:spacing w:after="240"/>
+        <w:jc w:val="center"/>
+      </w:pPr>
+      <w:r>
+        <w:rPr>
+          <w:i/>
+          <w:iCs/>
+          <w:color w:val="595959"/>
+          <w:sz w:val="18"/>
+          <w:szCs w:val="18"/>
+        </w:rPr>
+        <w:t xml:space="preserve">Figure 7 — WAVE summary for the hosted baseline.</w:t>
+      </w:r>
+    </w:p>
+    <w:p>
+      <w:pPr>
+        <w:spacing w:after="60" w:before="120"/>
+        <w:jc w:val="center"/>
+      </w:pPr>
+      <w:r>
+        <w:drawing>
+          <wp:inline distT="0" distB="0" distL="0" distR="0">
+            <wp:extent cx="2667000" cy="3409950"/>
+            <wp:effectExtent t="0" r="0" b="0" l="0"/>
+            <wp:docPr id="8" name="figure" descr="Figure 8 — WAVE summary for the hosted optimised page." title="Figure 8 — WAVE summary for the hosted optimised page."/>
+            <wp:cNvGraphicFramePr>
+              <a:graphicFrameLocks xmlns:a="http://schemas.openxmlformats.org/drawingml/2006/main" noChangeAspect="1"/>
+            </wp:cNvGraphicFramePr>
+            <a:graphic xmlns:a="http://schemas.openxmlformats.org/drawingml/2006/main">
+              <a:graphicData uri="http://schemas.openxmlformats.org/drawingml/2006/picture">
+                <pic:pic xmlns:pic="http://schemas.openxmlformats.org/drawingml/2006/picture">
+                  <pic:nvPicPr>
+                    <pic:cNvPr id="0" name="" descr=""/>
+                    <pic:cNvPicPr>
+                      <a:picLocks noChangeAspect="1" noChangeArrowheads="1"/>
+                    </pic:cNvPicPr>
+                  </pic:nvPicPr>
+                  <pic:blipFill>
+                    <a:blip r:embed="rId16" cstate="none"/>
+                    <a:srcRect/>
+                    <a:stretch>
+                      <a:fillRect/>
+                    </a:stretch>
+                  </pic:blipFill>
+                  <pic:spPr bwMode="auto">
+                    <a:xfrm>
+                      <a:off x="0" y="0"/>
+                      <a:ext cx="2667000" cy="3409950"/>
+                    </a:xfrm>
+                    <a:prstGeom prst="rect">
+                      <a:avLst/>
+                    </a:prstGeom>
+                  </pic:spPr>
+                </pic:pic>
+              </a:graphicData>
+            </a:graphic>
+          </wp:inline>
+        </w:drawing>
+      </w:r>
+    </w:p>
+    <w:p>
+      <w:pPr>
+        <w:spacing w:after="240"/>
+        <w:jc w:val="center"/>
+      </w:pPr>
+      <w:r>
+        <w:rPr>
+          <w:i/>
+          <w:iCs/>
+          <w:color w:val="595959"/>
+          <w:sz w:val="18"/>
+          <w:szCs w:val="18"/>
+        </w:rPr>
+        <w:t xml:space="preserve">Figure 8 — WAVE summary for the hosted optimised page.</w:t>
+      </w:r>
+    </w:p>
+    <w:p>
+      <w:pPr>
+        <w:pStyle w:val="Heading3"/>
+      </w:pPr>
+      <w:r>
+        <w:t xml:space="preserve">WebPageTest (one run per test)</w:t>
+      </w:r>
+    </w:p>
+    <w:tbl>
+      <w:tblPr>
+        <w:tblW w:type="dxa" w:w="9026"/>
+        <w:tblBorders>
+          <w:top w:val="single" w:color="auto" w:sz="4"/>
+          <w:left w:val="single" w:color="auto" w:sz="4"/>
+          <w:bottom w:val="single" w:color="auto" w:sz="4"/>
+          <w:right w:val="single" w:color="auto" w:sz="4"/>
+          <w:insideH w:val="single" w:color="auto" w:sz="4"/>
+          <w:insideV w:val="single" w:color="auto" w:sz="4"/>
+        </w:tblBorders>
+        <w:tblLayout w:type="fixed"/>
+      </w:tblPr>
+      <w:tblGrid>
+        <w:gridCol w:w="2226"/>
+        <w:gridCol w:w="1700"/>
+        <w:gridCol w:w="1700"/>
+        <w:gridCol w:w="1700"/>
+        <w:gridCol w:w="1700"/>
+      </w:tblGrid>
+      <w:tr>
+        <w:trPr>
+          <w:tblHeader/>
+        </w:trPr>
+        <w:tc>
+          <w:tcPr>
+            <w:tcW w:type="dxa" w:w="2226"/>
+            <w:tcBorders>
+              <w:top w:val="single" w:color="BFBFBF" w:sz="4"/>
+              <w:left w:val="single" w:color="BFBFBF" w:sz="4"/>
+              <w:bottom w:val="single" w:color="BFBFBF" w:sz="4"/>
+              <w:right w:val="single" w:color="BFBFBF" w:sz="4"/>
+            </w:tcBorders>
+            <w:shd w:fill="DCE6F1" w:color="auto" w:val="clear"/>
+            <w:tcMar>
+              <w:top w:type="dxa" w:w="60"/>
+              <w:left w:type="dxa" w:w="100"/>
+              <w:bottom w:type="dxa" w:w="60"/>
+              <w:right w:type="dxa" w:w="100"/>
+            </w:tcMar>
+          </w:tcPr>
+          <w:p>
+            <w:pPr>
+              <w:spacing w:after="0"/>
+            </w:pPr>
+            <w:r>
+              <w:rPr>
+                <w:b/>
+                <w:bCs/>
+                <w:sz w:val="19"/>
+                <w:szCs w:val="19"/>
+              </w:rPr>
+              <w:t xml:space="preserve">Metric</w:t>
+            </w:r>
+          </w:p>
+        </w:tc>
+        <w:tc>
+          <w:tcPr>
+            <w:tcW w:type="dxa" w:w="1700"/>
+            <w:tcBorders>
+              <w:top w:val="single" w:color="BFBFBF" w:sz="4"/>
+              <w:left w:val="single" w:color="BFBFBF" w:sz="4"/>
+              <w:bottom w:val="single" w:color="BFBFBF" w:sz="4"/>
+              <w:right w:val="single" w:color="BFBFBF" w:sz="4"/>
+            </w:tcBorders>
+            <w:shd w:fill="DCE6F1" w:color="auto" w:val="clear"/>
+            <w:tcMar>
+              <w:top w:type="dxa" w:w="60"/>
+              <w:left w:type="dxa" w:w="100"/>
+              <w:bottom w:type="dxa" w:w="60"/>
+              <w:right w:type="dxa" w:w="100"/>
+            </w:tcMar>
+          </w:tcPr>
+          <w:p>
+            <w:pPr>
+              <w:spacing w:after="0"/>
+            </w:pPr>
+            <w:r>
+              <w:rPr>
+                <w:b/>
+                <w:bCs/>
+                <w:sz w:val="19"/>
+                <w:szCs w:val="19"/>
+              </w:rPr>
+              <w:t xml:space="preserve">Baseline mobile</w:t>
+            </w:r>
+          </w:p>
+        </w:tc>
+        <w:tc>
+          <w:tcPr>
+            <w:tcW w:type="dxa" w:w="1700"/>
+            <w:tcBorders>
+              <w:top w:val="single" w:color="BFBFBF" w:sz="4"/>
+              <w:left w:val="single" w:color="BFBFBF" w:sz="4"/>
+              <w:bottom w:val="single" w:color="BFBFBF" w:sz="4"/>
+              <w:right w:val="single" w:color="BFBFBF" w:sz="4"/>
+            </w:tcBorders>
+            <w:shd w:fill="DCE6F1" w:color="auto" w:val="clear"/>
+            <w:tcMar>
+              <w:top w:type="dxa" w:w="60"/>
+              <w:left w:type="dxa" w:w="100"/>
+              <w:bottom w:type="dxa" w:w="60"/>
+              <w:right w:type="dxa" w:w="100"/>
+            </w:tcMar>
+          </w:tcPr>
+          <w:p>
+            <w:pPr>
+              <w:spacing w:after="0"/>
+            </w:pPr>
+            <w:r>
+              <w:rPr>
+                <w:b/>
+                <w:bCs/>
+                <w:sz w:val="19"/>
+                <w:szCs w:val="19"/>
+              </w:rPr>
+              <w:t xml:space="preserve">Optimised mobile</w:t>
+            </w:r>
+          </w:p>
+        </w:tc>
+        <w:tc>
+          <w:tcPr>
+            <w:tcW w:type="dxa" w:w="1700"/>
+            <w:tcBorders>
+              <w:top w:val="single" w:color="BFBFBF" w:sz="4"/>
+              <w:left w:val="single" w:color="BFBFBF" w:sz="4"/>
+              <w:bottom w:val="single" w:color="BFBFBF" w:sz="4"/>
+              <w:right w:val="single" w:color="BFBFBF" w:sz="4"/>
+            </w:tcBorders>
+            <w:shd w:fill="DCE6F1" w:color="auto" w:val="clear"/>
+            <w:tcMar>
+              <w:top w:type="dxa" w:w="60"/>
+              <w:left w:type="dxa" w:w="100"/>
+              <w:bottom w:type="dxa" w:w="60"/>
+              <w:right w:type="dxa" w:w="100"/>
+            </w:tcMar>
+          </w:tcPr>
+          <w:p>
+            <w:pPr>
+              <w:spacing w:after="0"/>
+            </w:pPr>
+            <w:r>
+              <w:rPr>
+                <w:b/>
+                <w:bCs/>
+                <w:sz w:val="19"/>
+                <w:szCs w:val="19"/>
+              </w:rPr>
+              <w:t xml:space="preserve">Baseline desktop</w:t>
+            </w:r>
+          </w:p>
+        </w:tc>
+        <w:tc>
+          <w:tcPr>
+            <w:tcW w:type="dxa" w:w="1700"/>
+            <w:tcBorders>
+              <w:top w:val="single" w:color="BFBFBF" w:sz="4"/>
+              <w:left w:val="single" w:color="BFBFBF" w:sz="4"/>
+              <w:bottom w:val="single" w:color="BFBFBF" w:sz="4"/>
+              <w:right w:val="single" w:color="BFBFBF" w:sz="4"/>
+            </w:tcBorders>
+            <w:shd w:fill="DCE6F1" w:color="auto" w:val="clear"/>
+            <w:tcMar>
+              <w:top w:type="dxa" w:w="60"/>
+              <w:left w:type="dxa" w:w="100"/>
+              <w:bottom w:type="dxa" w:w="60"/>
+              <w:right w:type="dxa" w:w="100"/>
+            </w:tcMar>
+          </w:tcPr>
+          <w:p>
+            <w:pPr>
+              <w:spacing w:after="0"/>
+            </w:pPr>
+            <w:r>
+              <w:rPr>
+                <w:b/>
+                <w:bCs/>
+                <w:sz w:val="19"/>
+                <w:szCs w:val="19"/>
+              </w:rPr>
+              <w:t xml:space="preserve">Optimised desktop</w:t>
+            </w:r>
+          </w:p>
+        </w:tc>
+      </w:tr>
+      <w:tr>
+        <w:tc>
+          <w:tcPr>
+            <w:tcW w:type="dxa" w:w="2226"/>
+            <w:tcBorders>
+              <w:top w:val="single" w:color="BFBFBF" w:sz="4"/>
+              <w:left w:val="single" w:color="BFBFBF" w:sz="4"/>
+              <w:bottom w:val="single" w:color="BFBFBF" w:sz="4"/>
+              <w:right w:val="single" w:color="BFBFBF" w:sz="4"/>
+            </w:tcBorders>
+            <w:tcMar>
+              <w:top w:type="dxa" w:w="60"/>
+              <w:left w:type="dxa" w:w="100"/>
+              <w:bottom w:type="dxa" w:w="60"/>
+              <w:right w:type="dxa" w:w="100"/>
+            </w:tcMar>
+          </w:tcPr>
+          <w:p>
+            <w:pPr>
+              <w:spacing w:after="0"/>
+            </w:pPr>
+            <w:r>
+              <w:rPr>
+                <w:b w:val="false"/>
+                <w:bCs w:val="false"/>
+                <w:sz w:val="19"/>
+                <w:szCs w:val="19"/>
+              </w:rPr>
+              <w:t xml:space="preserve">First Contentful Paint</w:t>
+            </w:r>
+          </w:p>
+        </w:tc>
+        <w:tc>
+          <w:tcPr>
+            <w:tcW w:type="dxa" w:w="1700"/>
+            <w:tcBorders>
+              <w:top w:val="single" w:color="BFBFBF" w:sz="4"/>
+              <w:left w:val="single" w:color="BFBFBF" w:sz="4"/>
+              <w:bottom w:val="single" w:color="BFBFBF" w:sz="4"/>
+              <w:right w:val="single" w:color="BFBFBF" w:sz="4"/>
+            </w:tcBorders>
+            <w:tcMar>
+              <w:top w:type="dxa" w:w="60"/>
+              <w:left w:type="dxa" w:w="100"/>
+              <w:bottom w:type="dxa" w:w="60"/>
+              <w:right w:type="dxa" w:w="100"/>
+            </w:tcMar>
+          </w:tcPr>
+          <w:p>
+            <w:pPr>
+              <w:spacing w:after="0"/>
+            </w:pPr>
+            <w:r>
+              <w:rPr>
+                <w:b w:val="false"/>
+                <w:bCs w:val="false"/>
+                <w:sz w:val="19"/>
+                <w:szCs w:val="19"/>
+              </w:rPr>
+              <w:t xml:space="preserve">2.210 s</w:t>
+            </w:r>
+          </w:p>
+        </w:tc>
+        <w:tc>
+          <w:tcPr>
+            <w:tcW w:type="dxa" w:w="1700"/>
+            <w:tcBorders>
+              <w:top w:val="single" w:color="BFBFBF" w:sz="4"/>
+              <w:left w:val="single" w:color="BFBFBF" w:sz="4"/>
+              <w:bottom w:val="single" w:color="BFBFBF" w:sz="4"/>
+              <w:right w:val="single" w:color="BFBFBF" w:sz="4"/>
+            </w:tcBorders>
+            <w:tcMar>
+              <w:top w:type="dxa" w:w="60"/>
+              <w:left w:type="dxa" w:w="100"/>
+              <w:bottom w:type="dxa" w:w="60"/>
+              <w:right w:type="dxa" w:w="100"/>
+            </w:tcMar>
+          </w:tcPr>
+          <w:p>
+            <w:pPr>
+              <w:spacing w:after="0"/>
+            </w:pPr>
+            <w:r>
+              <w:rPr>
+                <w:b w:val="false"/>
+                <w:bCs w:val="false"/>
+                <w:sz w:val="19"/>
+                <w:szCs w:val="19"/>
+              </w:rPr>
+              <w:t xml:space="preserve">1.122 s</w:t>
+            </w:r>
+          </w:p>
+        </w:tc>
+        <w:tc>
+          <w:tcPr>
+            <w:tcW w:type="dxa" w:w="1700"/>
+            <w:tcBorders>
+              <w:top w:val="single" w:color="BFBFBF" w:sz="4"/>
+              <w:left w:val="single" w:color="BFBFBF" w:sz="4"/>
+              <w:bottom w:val="single" w:color="BFBFBF" w:sz="4"/>
+              <w:right w:val="single" w:color="BFBFBF" w:sz="4"/>
+            </w:tcBorders>
+            <w:tcMar>
+              <w:top w:type="dxa" w:w="60"/>
+              <w:left w:type="dxa" w:w="100"/>
+              <w:bottom w:type="dxa" w:w="60"/>
+              <w:right w:type="dxa" w:w="100"/>
+            </w:tcMar>
+          </w:tcPr>
+          <w:p>
+            <w:pPr>
+              <w:spacing w:after="0"/>
+            </w:pPr>
+            <w:r>
+              <w:rPr>
+                <w:b w:val="false"/>
+                <w:bCs w:val="false"/>
+                <w:sz w:val="19"/>
+                <w:szCs w:val="19"/>
+              </w:rPr>
+              <w:t xml:space="preserve">0.665 s</w:t>
+            </w:r>
+          </w:p>
+        </w:tc>
+        <w:tc>
+          <w:tcPr>
+            <w:tcW w:type="dxa" w:w="1700"/>
+            <w:tcBorders>
+              <w:top w:val="single" w:color="BFBFBF" w:sz="4"/>
+              <w:left w:val="single" w:color="BFBFBF" w:sz="4"/>
+              <w:bottom w:val="single" w:color="BFBFBF" w:sz="4"/>
+              <w:right w:val="single" w:color="BFBFBF" w:sz="4"/>
+            </w:tcBorders>
+            <w:tcMar>
+              <w:top w:type="dxa" w:w="60"/>
+              <w:left w:type="dxa" w:w="100"/>
+              <w:bottom w:type="dxa" w:w="60"/>
+              <w:right w:type="dxa" w:w="100"/>
+            </w:tcMar>
+          </w:tcPr>
+          <w:p>
+            <w:pPr>
+              <w:spacing w:after="0"/>
+            </w:pPr>
+            <w:r>
+              <w:rPr>
+                <w:b w:val="false"/>
+                <w:bCs w:val="false"/>
+                <w:sz w:val="19"/>
+                <w:szCs w:val="19"/>
+              </w:rPr>
+              <w:t xml:space="preserve">0.355 s</w:t>
+            </w:r>
+          </w:p>
+        </w:tc>
+      </w:tr>
+      <w:tr>
+        <w:tc>
+          <w:tcPr>
+            <w:tcW w:type="dxa" w:w="2226"/>
+            <w:tcBorders>
+              <w:top w:val="single" w:color="BFBFBF" w:sz="4"/>
+              <w:left w:val="single" w:color="BFBFBF" w:sz="4"/>
+              <w:bottom w:val="single" w:color="BFBFBF" w:sz="4"/>
+              <w:right w:val="single" w:color="BFBFBF" w:sz="4"/>
+            </w:tcBorders>
+            <w:tcMar>
+              <w:top w:type="dxa" w:w="60"/>
+              <w:left w:type="dxa" w:w="100"/>
+              <w:bottom w:type="dxa" w:w="60"/>
+              <w:right w:type="dxa" w:w="100"/>
+            </w:tcMar>
+          </w:tcPr>
+          <w:p>
+            <w:pPr>
+              <w:spacing w:after="0"/>
+            </w:pPr>
+            <w:r>
+              <w:rPr>
+                <w:b w:val="false"/>
+                <w:bCs w:val="false"/>
+                <w:sz w:val="19"/>
+                <w:szCs w:val="19"/>
+              </w:rPr>
+              <w:t xml:space="preserve">Largest Contentful Paint</w:t>
+            </w:r>
+          </w:p>
+        </w:tc>
+        <w:tc>
+          <w:tcPr>
+            <w:tcW w:type="dxa" w:w="1700"/>
+            <w:tcBorders>
+              <w:top w:val="single" w:color="BFBFBF" w:sz="4"/>
+              <w:left w:val="single" w:color="BFBFBF" w:sz="4"/>
+              <w:bottom w:val="single" w:color="BFBFBF" w:sz="4"/>
+              <w:right w:val="single" w:color="BFBFBF" w:sz="4"/>
+            </w:tcBorders>
+            <w:tcMar>
+              <w:top w:type="dxa" w:w="60"/>
+              <w:left w:type="dxa" w:w="100"/>
+              <w:bottom w:type="dxa" w:w="60"/>
+              <w:right w:type="dxa" w:w="100"/>
+            </w:tcMar>
+          </w:tcPr>
+          <w:p>
+            <w:pPr>
+              <w:spacing w:after="0"/>
+            </w:pPr>
+            <w:r>
+              <w:rPr>
+                <w:b w:val="false"/>
+                <w:bCs w:val="false"/>
+                <w:sz w:val="19"/>
+                <w:szCs w:val="19"/>
+              </w:rPr>
+              <w:t xml:space="preserve">5.109 s</w:t>
+            </w:r>
+          </w:p>
+        </w:tc>
+        <w:tc>
+          <w:tcPr>
+            <w:tcW w:type="dxa" w:w="1700"/>
+            <w:tcBorders>
+              <w:top w:val="single" w:color="BFBFBF" w:sz="4"/>
+              <w:left w:val="single" w:color="BFBFBF" w:sz="4"/>
+              <w:bottom w:val="single" w:color="BFBFBF" w:sz="4"/>
+              <w:right w:val="single" w:color="BFBFBF" w:sz="4"/>
+            </w:tcBorders>
+            <w:tcMar>
+              <w:top w:type="dxa" w:w="60"/>
+              <w:left w:type="dxa" w:w="100"/>
+              <w:bottom w:type="dxa" w:w="60"/>
+              <w:right w:type="dxa" w:w="100"/>
+            </w:tcMar>
+          </w:tcPr>
+          <w:p>
+            <w:pPr>
+              <w:spacing w:after="0"/>
+            </w:pPr>
+            <w:r>
+              <w:rPr>
+                <w:b w:val="false"/>
+                <w:bCs w:val="false"/>
+                <w:sz w:val="19"/>
+                <w:szCs w:val="19"/>
+              </w:rPr>
+              <w:t xml:space="preserve">1.630 s</w:t>
+            </w:r>
+          </w:p>
+        </w:tc>
+        <w:tc>
+          <w:tcPr>
+            <w:tcW w:type="dxa" w:w="1700"/>
+            <w:tcBorders>
+              <w:top w:val="single" w:color="BFBFBF" w:sz="4"/>
+              <w:left w:val="single" w:color="BFBFBF" w:sz="4"/>
+              <w:bottom w:val="single" w:color="BFBFBF" w:sz="4"/>
+              <w:right w:val="single" w:color="BFBFBF" w:sz="4"/>
+            </w:tcBorders>
+            <w:tcMar>
+              <w:top w:type="dxa" w:w="60"/>
+              <w:left w:type="dxa" w:w="100"/>
+              <w:bottom w:type="dxa" w:w="60"/>
+              <w:right w:type="dxa" w:w="100"/>
+            </w:tcMar>
+          </w:tcPr>
+          <w:p>
+            <w:pPr>
+              <w:spacing w:after="0"/>
+            </w:pPr>
+            <w:r>
+              <w:rPr>
+                <w:b w:val="false"/>
+                <w:bCs w:val="false"/>
+                <w:sz w:val="19"/>
+                <w:szCs w:val="19"/>
+              </w:rPr>
+              <w:t xml:space="preserve">1.156 s</w:t>
+            </w:r>
+          </w:p>
+        </w:tc>
+        <w:tc>
+          <w:tcPr>
+            <w:tcW w:type="dxa" w:w="1700"/>
+            <w:tcBorders>
+              <w:top w:val="single" w:color="BFBFBF" w:sz="4"/>
+              <w:left w:val="single" w:color="BFBFBF" w:sz="4"/>
+              <w:bottom w:val="single" w:color="BFBFBF" w:sz="4"/>
+              <w:right w:val="single" w:color="BFBFBF" w:sz="4"/>
+            </w:tcBorders>
+            <w:tcMar>
+              <w:top w:type="dxa" w:w="60"/>
+              <w:left w:type="dxa" w:w="100"/>
+              <w:bottom w:type="dxa" w:w="60"/>
+              <w:right w:type="dxa" w:w="100"/>
+            </w:tcMar>
+          </w:tcPr>
+          <w:p>
+            <w:pPr>
+              <w:spacing w:after="0"/>
+            </w:pPr>
+            <w:r>
+              <w:rPr>
+                <w:b w:val="false"/>
+                <w:bCs w:val="false"/>
+                <w:sz w:val="19"/>
+                <w:szCs w:val="19"/>
+              </w:rPr>
+              <w:t xml:space="preserve">0.572 s</w:t>
+            </w:r>
+          </w:p>
+        </w:tc>
+      </w:tr>
+      <w:tr>
+        <w:tc>
+          <w:tcPr>
+            <w:tcW w:type="dxa" w:w="2226"/>
+            <w:tcBorders>
+              <w:top w:val="single" w:color="BFBFBF" w:sz="4"/>
+              <w:left w:val="single" w:color="BFBFBF" w:sz="4"/>
+              <w:bottom w:val="single" w:color="BFBFBF" w:sz="4"/>
+              <w:right w:val="single" w:color="BFBFBF" w:sz="4"/>
+            </w:tcBorders>
+            <w:tcMar>
+              <w:top w:type="dxa" w:w="60"/>
+              <w:left w:type="dxa" w:w="100"/>
+              <w:bottom w:type="dxa" w:w="60"/>
+              <w:right w:type="dxa" w:w="100"/>
+            </w:tcMar>
+          </w:tcPr>
+          <w:p>
+            <w:pPr>
+              <w:spacing w:after="0"/>
+            </w:pPr>
+            <w:r>
+              <w:rPr>
+                <w:b w:val="false"/>
+                <w:bCs w:val="false"/>
+                <w:sz w:val="19"/>
+                <w:szCs w:val="19"/>
+              </w:rPr>
+              <w:t xml:space="preserve">Cumulative Layout Shift</w:t>
+            </w:r>
+          </w:p>
+        </w:tc>
+        <w:tc>
+          <w:tcPr>
+            <w:tcW w:type="dxa" w:w="1700"/>
+            <w:tcBorders>
+              <w:top w:val="single" w:color="BFBFBF" w:sz="4"/>
+              <w:left w:val="single" w:color="BFBFBF" w:sz="4"/>
+              <w:bottom w:val="single" w:color="BFBFBF" w:sz="4"/>
+              <w:right w:val="single" w:color="BFBFBF" w:sz="4"/>
+            </w:tcBorders>
+            <w:tcMar>
+              <w:top w:type="dxa" w:w="60"/>
+              <w:left w:type="dxa" w:w="100"/>
+              <w:bottom w:type="dxa" w:w="60"/>
+              <w:right w:type="dxa" w:w="100"/>
+            </w:tcMar>
+          </w:tcPr>
+          <w:p>
+            <w:pPr>
+              <w:spacing w:after="0"/>
+            </w:pPr>
+            <w:r>
+              <w:rPr>
+                <w:b w:val="false"/>
+                <w:bCs w:val="false"/>
+                <w:sz w:val="19"/>
+                <w:szCs w:val="19"/>
+              </w:rPr>
+              <w:t xml:space="preserve">0</w:t>
+            </w:r>
+          </w:p>
+        </w:tc>
+        <w:tc>
+          <w:tcPr>
+            <w:tcW w:type="dxa" w:w="1700"/>
+            <w:tcBorders>
+              <w:top w:val="single" w:color="BFBFBF" w:sz="4"/>
+              <w:left w:val="single" w:color="BFBFBF" w:sz="4"/>
+              <w:bottom w:val="single" w:color="BFBFBF" w:sz="4"/>
+              <w:right w:val="single" w:color="BFBFBF" w:sz="4"/>
+            </w:tcBorders>
+            <w:tcMar>
+              <w:top w:type="dxa" w:w="60"/>
+              <w:left w:type="dxa" w:w="100"/>
+              <w:bottom w:type="dxa" w:w="60"/>
+              <w:right w:type="dxa" w:w="100"/>
+            </w:tcMar>
+          </w:tcPr>
+          <w:p>
+            <w:pPr>
+              <w:spacing w:after="0"/>
+            </w:pPr>
+            <w:r>
+              <w:rPr>
+                <w:b w:val="false"/>
+                <w:bCs w:val="false"/>
+                <w:sz w:val="19"/>
+                <w:szCs w:val="19"/>
+              </w:rPr>
+              <w:t xml:space="preserve">0</w:t>
+            </w:r>
+          </w:p>
+        </w:tc>
+        <w:tc>
+          <w:tcPr>
+            <w:tcW w:type="dxa" w:w="1700"/>
+            <w:tcBorders>
+              <w:top w:val="single" w:color="BFBFBF" w:sz="4"/>
+              <w:left w:val="single" w:color="BFBFBF" w:sz="4"/>
+              <w:bottom w:val="single" w:color="BFBFBF" w:sz="4"/>
+              <w:right w:val="single" w:color="BFBFBF" w:sz="4"/>
+            </w:tcBorders>
+            <w:tcMar>
+              <w:top w:type="dxa" w:w="60"/>
+              <w:left w:type="dxa" w:w="100"/>
+              <w:bottom w:type="dxa" w:w="60"/>
+              <w:right w:type="dxa" w:w="100"/>
+            </w:tcMar>
+          </w:tcPr>
+          <w:p>
+            <w:pPr>
+              <w:spacing w:after="0"/>
+            </w:pPr>
+            <w:r>
+              <w:rPr>
+                <w:b w:val="false"/>
+                <w:bCs w:val="false"/>
+                <w:sz w:val="19"/>
+                <w:szCs w:val="19"/>
+              </w:rPr>
+              <w:t xml:space="preserve">0.439</w:t>
+            </w:r>
+          </w:p>
+        </w:tc>
+        <w:tc>
+          <w:tcPr>
+            <w:tcW w:type="dxa" w:w="1700"/>
+            <w:tcBorders>
+              <w:top w:val="single" w:color="BFBFBF" w:sz="4"/>
+              <w:left w:val="single" w:color="BFBFBF" w:sz="4"/>
+              <w:bottom w:val="single" w:color="BFBFBF" w:sz="4"/>
+              <w:right w:val="single" w:color="BFBFBF" w:sz="4"/>
+            </w:tcBorders>
+            <w:tcMar>
+              <w:top w:type="dxa" w:w="60"/>
+              <w:left w:type="dxa" w:w="100"/>
+              <w:bottom w:type="dxa" w:w="60"/>
+              <w:right w:type="dxa" w:w="100"/>
+            </w:tcMar>
+          </w:tcPr>
+          <w:p>
+            <w:pPr>
+              <w:spacing w:after="0"/>
+            </w:pPr>
+            <w:r>
+              <w:rPr>
+                <w:b w:val="false"/>
+                <w:bCs w:val="false"/>
+                <w:sz w:val="19"/>
+                <w:szCs w:val="19"/>
+              </w:rPr>
+              <w:t xml:space="preserve">0</w:t>
+            </w:r>
+          </w:p>
+        </w:tc>
+      </w:tr>
+      <w:tr>
+        <w:tc>
+          <w:tcPr>
+            <w:tcW w:type="dxa" w:w="2226"/>
+            <w:tcBorders>
+              <w:top w:val="single" w:color="BFBFBF" w:sz="4"/>
+              <w:left w:val="single" w:color="BFBFBF" w:sz="4"/>
+              <w:bottom w:val="single" w:color="BFBFBF" w:sz="4"/>
+              <w:right w:val="single" w:color="BFBFBF" w:sz="4"/>
+            </w:tcBorders>
+            <w:tcMar>
+              <w:top w:type="dxa" w:w="60"/>
+              <w:left w:type="dxa" w:w="100"/>
+              <w:bottom w:type="dxa" w:w="60"/>
+              <w:right w:type="dxa" w:w="100"/>
+            </w:tcMar>
+          </w:tcPr>
+          <w:p>
+            <w:pPr>
+              <w:spacing w:after="0"/>
+            </w:pPr>
+            <w:r>
+              <w:rPr>
+                <w:b w:val="false"/>
+                <w:bCs w:val="false"/>
+                <w:sz w:val="19"/>
+                <w:szCs w:val="19"/>
+              </w:rPr>
+              <w:t xml:space="preserve">Speed Index</w:t>
+            </w:r>
+          </w:p>
+        </w:tc>
+        <w:tc>
+          <w:tcPr>
+            <w:tcW w:type="dxa" w:w="1700"/>
+            <w:tcBorders>
+              <w:top w:val="single" w:color="BFBFBF" w:sz="4"/>
+              <w:left w:val="single" w:color="BFBFBF" w:sz="4"/>
+              <w:bottom w:val="single" w:color="BFBFBF" w:sz="4"/>
+              <w:right w:val="single" w:color="BFBFBF" w:sz="4"/>
+            </w:tcBorders>
+            <w:tcMar>
+              <w:top w:type="dxa" w:w="60"/>
+              <w:left w:type="dxa" w:w="100"/>
+              <w:bottom w:type="dxa" w:w="60"/>
+              <w:right w:type="dxa" w:w="100"/>
+            </w:tcMar>
+          </w:tcPr>
+          <w:p>
+            <w:pPr>
+              <w:spacing w:after="0"/>
+            </w:pPr>
+            <w:r>
+              <w:rPr>
+                <w:b w:val="false"/>
+                <w:bCs w:val="false"/>
+                <w:sz w:val="19"/>
+                <w:szCs w:val="19"/>
+              </w:rPr>
+              <w:t xml:space="preserve">3.624 s</w:t>
+            </w:r>
+          </w:p>
+        </w:tc>
+        <w:tc>
+          <w:tcPr>
+            <w:tcW w:type="dxa" w:w="1700"/>
+            <w:tcBorders>
+              <w:top w:val="single" w:color="BFBFBF" w:sz="4"/>
+              <w:left w:val="single" w:color="BFBFBF" w:sz="4"/>
+              <w:bottom w:val="single" w:color="BFBFBF" w:sz="4"/>
+              <w:right w:val="single" w:color="BFBFBF" w:sz="4"/>
+            </w:tcBorders>
+            <w:tcMar>
+              <w:top w:type="dxa" w:w="60"/>
+              <w:left w:type="dxa" w:w="100"/>
+              <w:bottom w:type="dxa" w:w="60"/>
+              <w:right w:type="dxa" w:w="100"/>
+            </w:tcMar>
+          </w:tcPr>
+          <w:p>
+            <w:pPr>
+              <w:spacing w:after="0"/>
+            </w:pPr>
+            <w:r>
+              <w:rPr>
+                <w:b w:val="false"/>
+                <w:bCs w:val="false"/>
+                <w:sz w:val="19"/>
+                <w:szCs w:val="19"/>
+              </w:rPr>
+              <w:t xml:space="preserve">1.300 s</w:t>
+            </w:r>
+          </w:p>
+        </w:tc>
+        <w:tc>
+          <w:tcPr>
+            <w:tcW w:type="dxa" w:w="1700"/>
+            <w:tcBorders>
+              <w:top w:val="single" w:color="BFBFBF" w:sz="4"/>
+              <w:left w:val="single" w:color="BFBFBF" w:sz="4"/>
+              <w:bottom w:val="single" w:color="BFBFBF" w:sz="4"/>
+              <w:right w:val="single" w:color="BFBFBF" w:sz="4"/>
+            </w:tcBorders>
+            <w:tcMar>
+              <w:top w:type="dxa" w:w="60"/>
+              <w:left w:type="dxa" w:w="100"/>
+              <w:bottom w:type="dxa" w:w="60"/>
+              <w:right w:type="dxa" w:w="100"/>
+            </w:tcMar>
+          </w:tcPr>
+          <w:p>
+            <w:pPr>
+              <w:spacing w:after="0"/>
+            </w:pPr>
+            <w:r>
+              <w:rPr>
+                <w:b w:val="false"/>
+                <w:bCs w:val="false"/>
+                <w:sz w:val="19"/>
+                <w:szCs w:val="19"/>
+              </w:rPr>
+              <w:t xml:space="preserve">1.071 s</w:t>
+            </w:r>
+          </w:p>
+        </w:tc>
+        <w:tc>
+          <w:tcPr>
+            <w:tcW w:type="dxa" w:w="1700"/>
+            <w:tcBorders>
+              <w:top w:val="single" w:color="BFBFBF" w:sz="4"/>
+              <w:left w:val="single" w:color="BFBFBF" w:sz="4"/>
+              <w:bottom w:val="single" w:color="BFBFBF" w:sz="4"/>
+              <w:right w:val="single" w:color="BFBFBF" w:sz="4"/>
+            </w:tcBorders>
+            <w:tcMar>
+              <w:top w:type="dxa" w:w="60"/>
+              <w:left w:type="dxa" w:w="100"/>
+              <w:bottom w:type="dxa" w:w="60"/>
+              <w:right w:type="dxa" w:w="100"/>
+            </w:tcMar>
+          </w:tcPr>
+          <w:p>
+            <w:pPr>
+              <w:spacing w:after="0"/>
+            </w:pPr>
+            <w:r>
+              <w:rPr>
+                <w:b w:val="false"/>
+                <w:bCs w:val="false"/>
+                <w:sz w:val="19"/>
+                <w:szCs w:val="19"/>
+              </w:rPr>
+              <w:t xml:space="preserve">0.441 s</w:t>
+            </w:r>
+          </w:p>
+        </w:tc>
+      </w:tr>
+      <w:tr>
+        <w:tc>
+          <w:tcPr>
+            <w:tcW w:type="dxa" w:w="2226"/>
+            <w:tcBorders>
+              <w:top w:val="single" w:color="BFBFBF" w:sz="4"/>
+              <w:left w:val="single" w:color="BFBFBF" w:sz="4"/>
+              <w:bottom w:val="single" w:color="BFBFBF" w:sz="4"/>
+              <w:right w:val="single" w:color="BFBFBF" w:sz="4"/>
+            </w:tcBorders>
+            <w:tcMar>
+              <w:top w:type="dxa" w:w="60"/>
+              <w:left w:type="dxa" w:w="100"/>
+              <w:bottom w:type="dxa" w:w="60"/>
+              <w:right w:type="dxa" w:w="100"/>
+            </w:tcMar>
+          </w:tcPr>
+          <w:p>
+            <w:pPr>
+              <w:spacing w:after="0"/>
+            </w:pPr>
+            <w:r>
+              <w:rPr>
+                <w:b w:val="false"/>
+                <w:bCs w:val="false"/>
+                <w:sz w:val="19"/>
+                <w:szCs w:val="19"/>
+              </w:rPr>
+              <w:t xml:space="preserve">Time to First Byte</w:t>
+            </w:r>
+          </w:p>
+        </w:tc>
+        <w:tc>
+          <w:tcPr>
+            <w:tcW w:type="dxa" w:w="1700"/>
+            <w:tcBorders>
+              <w:top w:val="single" w:color="BFBFBF" w:sz="4"/>
+              <w:left w:val="single" w:color="BFBFBF" w:sz="4"/>
+              <w:bottom w:val="single" w:color="BFBFBF" w:sz="4"/>
+              <w:right w:val="single" w:color="BFBFBF" w:sz="4"/>
+            </w:tcBorders>
+            <w:tcMar>
+              <w:top w:type="dxa" w:w="60"/>
+              <w:left w:type="dxa" w:w="100"/>
+              <w:bottom w:type="dxa" w:w="60"/>
+              <w:right w:type="dxa" w:w="100"/>
+            </w:tcMar>
+          </w:tcPr>
+          <w:p>
+            <w:pPr>
+              <w:spacing w:after="0"/>
+            </w:pPr>
+            <w:r>
+              <w:rPr>
+                <w:b w:val="false"/>
+                <w:bCs w:val="false"/>
+                <w:sz w:val="19"/>
+                <w:szCs w:val="19"/>
+              </w:rPr>
+              <w:t xml:space="preserve">0.950 s</w:t>
+            </w:r>
+          </w:p>
+        </w:tc>
+        <w:tc>
+          <w:tcPr>
+            <w:tcW w:type="dxa" w:w="1700"/>
+            <w:tcBorders>
+              <w:top w:val="single" w:color="BFBFBF" w:sz="4"/>
+              <w:left w:val="single" w:color="BFBFBF" w:sz="4"/>
+              <w:bottom w:val="single" w:color="BFBFBF" w:sz="4"/>
+              <w:right w:val="single" w:color="BFBFBF" w:sz="4"/>
+            </w:tcBorders>
+            <w:tcMar>
+              <w:top w:type="dxa" w:w="60"/>
+              <w:left w:type="dxa" w:w="100"/>
+              <w:bottom w:type="dxa" w:w="60"/>
+              <w:right w:type="dxa" w:w="100"/>
+            </w:tcMar>
+          </w:tcPr>
+          <w:p>
+            <w:pPr>
+              <w:spacing w:after="0"/>
+            </w:pPr>
+            <w:r>
+              <w:rPr>
+                <w:b w:val="false"/>
+                <w:bCs w:val="false"/>
+                <w:sz w:val="19"/>
+                <w:szCs w:val="19"/>
+              </w:rPr>
+              <w:t xml:space="preserve">0.955 s</w:t>
+            </w:r>
+          </w:p>
+        </w:tc>
+        <w:tc>
+          <w:tcPr>
+            <w:tcW w:type="dxa" w:w="1700"/>
+            <w:tcBorders>
+              <w:top w:val="single" w:color="BFBFBF" w:sz="4"/>
+              <w:left w:val="single" w:color="BFBFBF" w:sz="4"/>
+              <w:bottom w:val="single" w:color="BFBFBF" w:sz="4"/>
+              <w:right w:val="single" w:color="BFBFBF" w:sz="4"/>
+            </w:tcBorders>
+            <w:tcMar>
+              <w:top w:type="dxa" w:w="60"/>
+              <w:left w:type="dxa" w:w="100"/>
+              <w:bottom w:type="dxa" w:w="60"/>
+              <w:right w:type="dxa" w:w="100"/>
+            </w:tcMar>
+          </w:tcPr>
+          <w:p>
+            <w:pPr>
+              <w:spacing w:after="0"/>
+            </w:pPr>
+            <w:r>
+              <w:rPr>
+                <w:b w:val="false"/>
+                <w:bCs w:val="false"/>
+                <w:sz w:val="19"/>
+                <w:szCs w:val="19"/>
+              </w:rPr>
+              <w:t xml:space="preserve">0.213 s</w:t>
+            </w:r>
+          </w:p>
+        </w:tc>
+        <w:tc>
+          <w:tcPr>
+            <w:tcW w:type="dxa" w:w="1700"/>
+            <w:tcBorders>
+              <w:top w:val="single" w:color="BFBFBF" w:sz="4"/>
+              <w:left w:val="single" w:color="BFBFBF" w:sz="4"/>
+              <w:bottom w:val="single" w:color="BFBFBF" w:sz="4"/>
+              <w:right w:val="single" w:color="BFBFBF" w:sz="4"/>
+            </w:tcBorders>
+            <w:tcMar>
+              <w:top w:type="dxa" w:w="60"/>
+              <w:left w:type="dxa" w:w="100"/>
+              <w:bottom w:type="dxa" w:w="60"/>
+              <w:right w:type="dxa" w:w="100"/>
+            </w:tcMar>
+          </w:tcPr>
+          <w:p>
+            <w:pPr>
+              <w:spacing w:after="0"/>
+            </w:pPr>
+            <w:r>
+              <w:rPr>
+                <w:b w:val="false"/>
+                <w:bCs w:val="false"/>
+                <w:sz w:val="19"/>
+                <w:szCs w:val="19"/>
+              </w:rPr>
+              <w:t xml:space="preserve">0.222 s</w:t>
+            </w:r>
+          </w:p>
+        </w:tc>
+      </w:tr>
+      <w:tr>
+        <w:tc>
+          <w:tcPr>
+            <w:tcW w:type="dxa" w:w="2226"/>
+            <w:tcBorders>
+              <w:top w:val="single" w:color="BFBFBF" w:sz="4"/>
+              <w:left w:val="single" w:color="BFBFBF" w:sz="4"/>
+              <w:bottom w:val="single" w:color="BFBFBF" w:sz="4"/>
+              <w:right w:val="single" w:color="BFBFBF" w:sz="4"/>
+            </w:tcBorders>
+            <w:tcMar>
+              <w:top w:type="dxa" w:w="60"/>
+              <w:left w:type="dxa" w:w="100"/>
+              <w:bottom w:type="dxa" w:w="60"/>
+              <w:right w:type="dxa" w:w="100"/>
+            </w:tcMar>
+          </w:tcPr>
+          <w:p>
+            <w:pPr>
+              <w:spacing w:after="0"/>
+            </w:pPr>
+            <w:r>
+              <w:rPr>
+                <w:b w:val="false"/>
+                <w:bCs w:val="false"/>
+                <w:sz w:val="19"/>
+                <w:szCs w:val="19"/>
+              </w:rPr>
+              <w:t xml:space="preserve">Total Blocking Time</w:t>
+            </w:r>
+          </w:p>
+        </w:tc>
+        <w:tc>
+          <w:tcPr>
+            <w:tcW w:type="dxa" w:w="1700"/>
+            <w:tcBorders>
+              <w:top w:val="single" w:color="BFBFBF" w:sz="4"/>
+              <w:left w:val="single" w:color="BFBFBF" w:sz="4"/>
+              <w:bottom w:val="single" w:color="BFBFBF" w:sz="4"/>
+              <w:right w:val="single" w:color="BFBFBF" w:sz="4"/>
+            </w:tcBorders>
+            <w:tcMar>
+              <w:top w:type="dxa" w:w="60"/>
+              <w:left w:type="dxa" w:w="100"/>
+              <w:bottom w:type="dxa" w:w="60"/>
+              <w:right w:type="dxa" w:w="100"/>
+            </w:tcMar>
+          </w:tcPr>
+          <w:p>
+            <w:pPr>
+              <w:spacing w:after="0"/>
+            </w:pPr>
+            <w:r>
+              <w:rPr>
+                <w:b w:val="false"/>
+                <w:bCs w:val="false"/>
+                <w:sz w:val="19"/>
+                <w:szCs w:val="19"/>
+              </w:rPr>
+              <w:t xml:space="preserve">0 s</w:t>
+            </w:r>
+          </w:p>
+        </w:tc>
+        <w:tc>
+          <w:tcPr>
+            <w:tcW w:type="dxa" w:w="1700"/>
+            <w:tcBorders>
+              <w:top w:val="single" w:color="BFBFBF" w:sz="4"/>
+              <w:left w:val="single" w:color="BFBFBF" w:sz="4"/>
+              <w:bottom w:val="single" w:color="BFBFBF" w:sz="4"/>
+              <w:right w:val="single" w:color="BFBFBF" w:sz="4"/>
+            </w:tcBorders>
+            <w:tcMar>
+              <w:top w:type="dxa" w:w="60"/>
+              <w:left w:type="dxa" w:w="100"/>
+              <w:bottom w:type="dxa" w:w="60"/>
+              <w:right w:type="dxa" w:w="100"/>
+            </w:tcMar>
+          </w:tcPr>
+          <w:p>
+            <w:pPr>
+              <w:spacing w:after="0"/>
+            </w:pPr>
+            <w:r>
+              <w:rPr>
+                <w:b w:val="false"/>
+                <w:bCs w:val="false"/>
+                <w:sz w:val="19"/>
+                <w:szCs w:val="19"/>
+              </w:rPr>
+              <w:t xml:space="preserve">0 s</w:t>
+            </w:r>
+          </w:p>
+        </w:tc>
+        <w:tc>
+          <w:tcPr>
+            <w:tcW w:type="dxa" w:w="1700"/>
+            <w:tcBorders>
+              <w:top w:val="single" w:color="BFBFBF" w:sz="4"/>
+              <w:left w:val="single" w:color="BFBFBF" w:sz="4"/>
+              <w:bottom w:val="single" w:color="BFBFBF" w:sz="4"/>
+              <w:right w:val="single" w:color="BFBFBF" w:sz="4"/>
+            </w:tcBorders>
+            <w:tcMar>
+              <w:top w:type="dxa" w:w="60"/>
+              <w:left w:type="dxa" w:w="100"/>
+              <w:bottom w:type="dxa" w:w="60"/>
+              <w:right w:type="dxa" w:w="100"/>
+            </w:tcMar>
+          </w:tcPr>
+          <w:p>
+            <w:pPr>
+              <w:spacing w:after="0"/>
+            </w:pPr>
+            <w:r>
+              <w:rPr>
+                <w:b w:val="false"/>
+                <w:bCs w:val="false"/>
+                <w:sz w:val="19"/>
+                <w:szCs w:val="19"/>
+              </w:rPr>
+              <w:t xml:space="preserve">0 s</w:t>
+            </w:r>
+          </w:p>
+        </w:tc>
+        <w:tc>
+          <w:tcPr>
+            <w:tcW w:type="dxa" w:w="1700"/>
+            <w:tcBorders>
+              <w:top w:val="single" w:color="BFBFBF" w:sz="4"/>
+              <w:left w:val="single" w:color="BFBFBF" w:sz="4"/>
+              <w:bottom w:val="single" w:color="BFBFBF" w:sz="4"/>
+              <w:right w:val="single" w:color="BFBFBF" w:sz="4"/>
+            </w:tcBorders>
+            <w:tcMar>
+              <w:top w:type="dxa" w:w="60"/>
+              <w:left w:type="dxa" w:w="100"/>
+              <w:bottom w:type="dxa" w:w="60"/>
+              <w:right w:type="dxa" w:w="100"/>
+            </w:tcMar>
+          </w:tcPr>
+          <w:p>
+            <w:pPr>
+              <w:spacing w:after="0"/>
+            </w:pPr>
+            <w:r>
+              <w:rPr>
+                <w:b w:val="false"/>
+                <w:bCs w:val="false"/>
+                <w:sz w:val="19"/>
+                <w:szCs w:val="19"/>
+              </w:rPr>
+              <w:t xml:space="preserve">0 s</w:t>
+            </w:r>
+          </w:p>
+        </w:tc>
+      </w:tr>
+      <w:tr>
+        <w:tc>
+          <w:tcPr>
+            <w:tcW w:type="dxa" w:w="2226"/>
+            <w:tcBorders>
+              <w:top w:val="single" w:color="BFBFBF" w:sz="4"/>
+              <w:left w:val="single" w:color="BFBFBF" w:sz="4"/>
+              <w:bottom w:val="single" w:color="BFBFBF" w:sz="4"/>
+              <w:right w:val="single" w:color="BFBFBF" w:sz="4"/>
+            </w:tcBorders>
+            <w:tcMar>
+              <w:top w:type="dxa" w:w="60"/>
+              <w:left w:type="dxa" w:w="100"/>
+              <w:bottom w:type="dxa" w:w="60"/>
+              <w:right w:type="dxa" w:w="100"/>
+            </w:tcMar>
+          </w:tcPr>
+          <w:p>
+            <w:pPr>
+              <w:spacing w:after="0"/>
+            </w:pPr>
+            <w:r>
+              <w:rPr>
+                <w:b w:val="false"/>
+                <w:bCs w:val="false"/>
+                <w:sz w:val="19"/>
+                <w:szCs w:val="19"/>
+              </w:rPr>
+              <w:t xml:space="preserve">Page weight</w:t>
+            </w:r>
+          </w:p>
+        </w:tc>
+        <w:tc>
+          <w:tcPr>
+            <w:tcW w:type="dxa" w:w="1700"/>
+            <w:tcBorders>
+              <w:top w:val="single" w:color="BFBFBF" w:sz="4"/>
+              <w:left w:val="single" w:color="BFBFBF" w:sz="4"/>
+              <w:bottom w:val="single" w:color="BFBFBF" w:sz="4"/>
+              <w:right w:val="single" w:color="BFBFBF" w:sz="4"/>
+            </w:tcBorders>
+            <w:tcMar>
+              <w:top w:type="dxa" w:w="60"/>
+              <w:left w:type="dxa" w:w="100"/>
+              <w:bottom w:type="dxa" w:w="60"/>
+              <w:right w:type="dxa" w:w="100"/>
+            </w:tcMar>
+          </w:tcPr>
+          <w:p>
+            <w:pPr>
+              <w:spacing w:after="0"/>
+            </w:pPr>
+            <w:r>
+              <w:rPr>
+                <w:b w:val="false"/>
+                <w:bCs w:val="false"/>
+                <w:sz w:val="19"/>
+                <w:szCs w:val="19"/>
+              </w:rPr>
+              <w:t xml:space="preserve">6,652,435 B</w:t>
+            </w:r>
+          </w:p>
+        </w:tc>
+        <w:tc>
+          <w:tcPr>
+            <w:tcW w:type="dxa" w:w="1700"/>
+            <w:tcBorders>
+              <w:top w:val="single" w:color="BFBFBF" w:sz="4"/>
+              <w:left w:val="single" w:color="BFBFBF" w:sz="4"/>
+              <w:bottom w:val="single" w:color="BFBFBF" w:sz="4"/>
+              <w:right w:val="single" w:color="BFBFBF" w:sz="4"/>
+            </w:tcBorders>
+            <w:tcMar>
+              <w:top w:type="dxa" w:w="60"/>
+              <w:left w:type="dxa" w:w="100"/>
+              <w:bottom w:type="dxa" w:w="60"/>
+              <w:right w:type="dxa" w:w="100"/>
+            </w:tcMar>
+          </w:tcPr>
+          <w:p>
+            <w:pPr>
+              <w:spacing w:after="0"/>
+            </w:pPr>
+            <w:r>
+              <w:rPr>
+                <w:b w:val="false"/>
+                <w:bCs w:val="false"/>
+                <w:sz w:val="19"/>
+                <w:szCs w:val="19"/>
+              </w:rPr>
+              <w:t xml:space="preserve">18,336 B</w:t>
+            </w:r>
+          </w:p>
+        </w:tc>
+        <w:tc>
+          <w:tcPr>
+            <w:tcW w:type="dxa" w:w="1700"/>
+            <w:tcBorders>
+              <w:top w:val="single" w:color="BFBFBF" w:sz="4"/>
+              <w:left w:val="single" w:color="BFBFBF" w:sz="4"/>
+              <w:bottom w:val="single" w:color="BFBFBF" w:sz="4"/>
+              <w:right w:val="single" w:color="BFBFBF" w:sz="4"/>
+            </w:tcBorders>
+            <w:tcMar>
+              <w:top w:type="dxa" w:w="60"/>
+              <w:left w:type="dxa" w:w="100"/>
+              <w:bottom w:type="dxa" w:w="60"/>
+              <w:right w:type="dxa" w:w="100"/>
+            </w:tcMar>
+          </w:tcPr>
+          <w:p>
+            <w:pPr>
+              <w:spacing w:after="0"/>
+            </w:pPr>
+            <w:r>
+              <w:rPr>
+                <w:b w:val="false"/>
+                <w:bCs w:val="false"/>
+                <w:sz w:val="19"/>
+                <w:szCs w:val="19"/>
+              </w:rPr>
+              <w:t xml:space="preserve">6,647,293 B</w:t>
+            </w:r>
+          </w:p>
+        </w:tc>
+        <w:tc>
+          <w:tcPr>
+            <w:tcW w:type="dxa" w:w="1700"/>
+            <w:tcBorders>
+              <w:top w:val="single" w:color="BFBFBF" w:sz="4"/>
+              <w:left w:val="single" w:color="BFBFBF" w:sz="4"/>
+              <w:bottom w:val="single" w:color="BFBFBF" w:sz="4"/>
+              <w:right w:val="single" w:color="BFBFBF" w:sz="4"/>
+            </w:tcBorders>
+            <w:tcMar>
+              <w:top w:type="dxa" w:w="60"/>
+              <w:left w:type="dxa" w:w="100"/>
+              <w:bottom w:type="dxa" w:w="60"/>
+              <w:right w:type="dxa" w:w="100"/>
+            </w:tcMar>
+          </w:tcPr>
+          <w:p>
+            <w:pPr>
+              <w:spacing w:after="0"/>
+            </w:pPr>
+            <w:r>
+              <w:rPr>
+                <w:b w:val="false"/>
+                <w:bCs w:val="false"/>
+                <w:sz w:val="19"/>
+                <w:szCs w:val="19"/>
+              </w:rPr>
+              <w:t xml:space="preserve">35,196 B</w:t>
+            </w:r>
+          </w:p>
+        </w:tc>
+      </w:tr>
+      <w:tr>
+        <w:tc>
+          <w:tcPr>
+            <w:tcW w:type="dxa" w:w="2226"/>
+            <w:tcBorders>
+              <w:top w:val="single" w:color="BFBFBF" w:sz="4"/>
+              <w:left w:val="single" w:color="BFBFBF" w:sz="4"/>
+              <w:bottom w:val="single" w:color="BFBFBF" w:sz="4"/>
+              <w:right w:val="single" w:color="BFBFBF" w:sz="4"/>
+            </w:tcBorders>
+            <w:tcMar>
+              <w:top w:type="dxa" w:w="60"/>
+              <w:left w:type="dxa" w:w="100"/>
+              <w:bottom w:type="dxa" w:w="60"/>
+              <w:right w:type="dxa" w:w="100"/>
+            </w:tcMar>
+          </w:tcPr>
+          <w:p>
+            <w:pPr>
+              <w:spacing w:after="0"/>
+            </w:pPr>
+            <w:r>
+              <w:rPr>
+                <w:b w:val="false"/>
+                <w:bCs w:val="false"/>
+                <w:sz w:val="19"/>
+                <w:szCs w:val="19"/>
+              </w:rPr>
+              <w:t xml:space="preserve">Requests (HTTP 4xx)</w:t>
+            </w:r>
+          </w:p>
+        </w:tc>
+        <w:tc>
+          <w:tcPr>
+            <w:tcW w:type="dxa" w:w="1700"/>
+            <w:tcBorders>
+              <w:top w:val="single" w:color="BFBFBF" w:sz="4"/>
+              <w:left w:val="single" w:color="BFBFBF" w:sz="4"/>
+              <w:bottom w:val="single" w:color="BFBFBF" w:sz="4"/>
+              <w:right w:val="single" w:color="BFBFBF" w:sz="4"/>
+            </w:tcBorders>
+            <w:tcMar>
+              <w:top w:type="dxa" w:w="60"/>
+              <w:left w:type="dxa" w:w="100"/>
+              <w:bottom w:type="dxa" w:w="60"/>
+              <w:right w:type="dxa" w:w="100"/>
+            </w:tcMar>
+          </w:tcPr>
+          <w:p>
+            <w:pPr>
+              <w:spacing w:after="0"/>
+            </w:pPr>
+            <w:r>
+              <w:rPr>
+                <w:b w:val="false"/>
+                <w:bCs w:val="false"/>
+                <w:sz w:val="19"/>
+                <w:szCs w:val="19"/>
+              </w:rPr>
+              <w:t xml:space="preserve">10 (1)</w:t>
+            </w:r>
+          </w:p>
+        </w:tc>
+        <w:tc>
+          <w:tcPr>
+            <w:tcW w:type="dxa" w:w="1700"/>
+            <w:tcBorders>
+              <w:top w:val="single" w:color="BFBFBF" w:sz="4"/>
+              <w:left w:val="single" w:color="BFBFBF" w:sz="4"/>
+              <w:bottom w:val="single" w:color="BFBFBF" w:sz="4"/>
+              <w:right w:val="single" w:color="BFBFBF" w:sz="4"/>
+            </w:tcBorders>
+            <w:tcMar>
+              <w:top w:type="dxa" w:w="60"/>
+              <w:left w:type="dxa" w:w="100"/>
+              <w:bottom w:type="dxa" w:w="60"/>
+              <w:right w:type="dxa" w:w="100"/>
+            </w:tcMar>
+          </w:tcPr>
+          <w:p>
+            <w:pPr>
+              <w:spacing w:after="0"/>
+            </w:pPr>
+            <w:r>
+              <w:rPr>
+                <w:b w:val="false"/>
+                <w:bCs w:val="false"/>
+                <w:sz w:val="19"/>
+                <w:szCs w:val="19"/>
+              </w:rPr>
+              <w:t xml:space="preserve">5 (0)</w:t>
+            </w:r>
+          </w:p>
+        </w:tc>
+        <w:tc>
+          <w:tcPr>
+            <w:tcW w:type="dxa" w:w="1700"/>
+            <w:tcBorders>
+              <w:top w:val="single" w:color="BFBFBF" w:sz="4"/>
+              <w:left w:val="single" w:color="BFBFBF" w:sz="4"/>
+              <w:bottom w:val="single" w:color="BFBFBF" w:sz="4"/>
+              <w:right w:val="single" w:color="BFBFBF" w:sz="4"/>
+            </w:tcBorders>
+            <w:tcMar>
+              <w:top w:type="dxa" w:w="60"/>
+              <w:left w:type="dxa" w:w="100"/>
+              <w:bottom w:type="dxa" w:w="60"/>
+              <w:right w:type="dxa" w:w="100"/>
+            </w:tcMar>
+          </w:tcPr>
+          <w:p>
+            <w:pPr>
+              <w:spacing w:after="0"/>
+            </w:pPr>
+            <w:r>
+              <w:rPr>
+                <w:b w:val="false"/>
+                <w:bCs w:val="false"/>
+                <w:sz w:val="19"/>
+                <w:szCs w:val="19"/>
+              </w:rPr>
+              <w:t xml:space="preserve">10 (1)</w:t>
+            </w:r>
+          </w:p>
+        </w:tc>
+        <w:tc>
+          <w:tcPr>
+            <w:tcW w:type="dxa" w:w="1700"/>
+            <w:tcBorders>
+              <w:top w:val="single" w:color="BFBFBF" w:sz="4"/>
+              <w:left w:val="single" w:color="BFBFBF" w:sz="4"/>
+              <w:bottom w:val="single" w:color="BFBFBF" w:sz="4"/>
+              <w:right w:val="single" w:color="BFBFBF" w:sz="4"/>
+            </w:tcBorders>
+            <w:tcMar>
+              <w:top w:type="dxa" w:w="60"/>
+              <w:left w:type="dxa" w:w="100"/>
+              <w:bottom w:type="dxa" w:w="60"/>
+              <w:right w:type="dxa" w:w="100"/>
+            </w:tcMar>
+          </w:tcPr>
+          <w:p>
+            <w:pPr>
+              <w:spacing w:after="0"/>
+            </w:pPr>
+            <w:r>
+              <w:rPr>
+                <w:b w:val="false"/>
+                <w:bCs w:val="false"/>
+                <w:sz w:val="19"/>
+                <w:szCs w:val="19"/>
+              </w:rPr>
+              <w:t xml:space="preserve">8 (0)</w:t>
+            </w:r>
+          </w:p>
+        </w:tc>
+      </w:tr>
+      <w:tr>
+        <w:tc>
+          <w:tcPr>
+            <w:tcW w:type="dxa" w:w="2226"/>
+            <w:tcBorders>
+              <w:top w:val="single" w:color="BFBFBF" w:sz="4"/>
+              <w:left w:val="single" w:color="BFBFBF" w:sz="4"/>
+              <w:bottom w:val="single" w:color="BFBFBF" w:sz="4"/>
+              <w:right w:val="single" w:color="BFBFBF" w:sz="4"/>
+            </w:tcBorders>
+            <w:tcMar>
+              <w:top w:type="dxa" w:w="60"/>
+              <w:left w:type="dxa" w:w="100"/>
+              <w:bottom w:type="dxa" w:w="60"/>
+              <w:right w:type="dxa" w:w="100"/>
+            </w:tcMar>
+          </w:tcPr>
+          <w:p>
+            <w:pPr>
+              <w:spacing w:after="0"/>
+            </w:pPr>
+            <w:r>
+              <w:rPr>
+                <w:b w:val="false"/>
+                <w:bCs w:val="false"/>
+                <w:sz w:val="19"/>
+                <w:szCs w:val="19"/>
+              </w:rPr>
+              <w:t xml:space="preserve">Render-blocking requests</w:t>
+            </w:r>
+          </w:p>
+        </w:tc>
+        <w:tc>
+          <w:tcPr>
+            <w:tcW w:type="dxa" w:w="1700"/>
+            <w:tcBorders>
+              <w:top w:val="single" w:color="BFBFBF" w:sz="4"/>
+              <w:left w:val="single" w:color="BFBFBF" w:sz="4"/>
+              <w:bottom w:val="single" w:color="BFBFBF" w:sz="4"/>
+              <w:right w:val="single" w:color="BFBFBF" w:sz="4"/>
+            </w:tcBorders>
+            <w:tcMar>
+              <w:top w:type="dxa" w:w="60"/>
+              <w:left w:type="dxa" w:w="100"/>
+              <w:bottom w:type="dxa" w:w="60"/>
+              <w:right w:type="dxa" w:w="100"/>
+            </w:tcMar>
+          </w:tcPr>
+          <w:p>
+            <w:pPr>
+              <w:spacing w:after="0"/>
+            </w:pPr>
+            <w:r>
+              <w:rPr>
+                <w:b w:val="false"/>
+                <w:bCs w:val="false"/>
+                <w:sz w:val="19"/>
+                <w:szCs w:val="19"/>
+              </w:rPr>
+              <w:t xml:space="preserve">4</w:t>
+            </w:r>
+          </w:p>
+        </w:tc>
+        <w:tc>
+          <w:tcPr>
+            <w:tcW w:type="dxa" w:w="1700"/>
+            <w:tcBorders>
+              <w:top w:val="single" w:color="BFBFBF" w:sz="4"/>
+              <w:left w:val="single" w:color="BFBFBF" w:sz="4"/>
+              <w:bottom w:val="single" w:color="BFBFBF" w:sz="4"/>
+              <w:right w:val="single" w:color="BFBFBF" w:sz="4"/>
+            </w:tcBorders>
+            <w:tcMar>
+              <w:top w:type="dxa" w:w="60"/>
+              <w:left w:type="dxa" w:w="100"/>
+              <w:bottom w:type="dxa" w:w="60"/>
+              <w:right w:type="dxa" w:w="100"/>
+            </w:tcMar>
+          </w:tcPr>
+          <w:p>
+            <w:pPr>
+              <w:spacing w:after="0"/>
+            </w:pPr>
+            <w:r>
+              <w:rPr>
+                <w:b w:val="false"/>
+                <w:bCs w:val="false"/>
+                <w:sz w:val="19"/>
+                <w:szCs w:val="19"/>
+              </w:rPr>
+              <w:t xml:space="preserve">0</w:t>
+            </w:r>
+          </w:p>
+        </w:tc>
+        <w:tc>
+          <w:tcPr>
+            <w:tcW w:type="dxa" w:w="1700"/>
+            <w:tcBorders>
+              <w:top w:val="single" w:color="BFBFBF" w:sz="4"/>
+              <w:left w:val="single" w:color="BFBFBF" w:sz="4"/>
+              <w:bottom w:val="single" w:color="BFBFBF" w:sz="4"/>
+              <w:right w:val="single" w:color="BFBFBF" w:sz="4"/>
+            </w:tcBorders>
+            <w:tcMar>
+              <w:top w:type="dxa" w:w="60"/>
+              <w:left w:type="dxa" w:w="100"/>
+              <w:bottom w:type="dxa" w:w="60"/>
+              <w:right w:type="dxa" w:w="100"/>
+            </w:tcMar>
+          </w:tcPr>
+          <w:p>
+            <w:pPr>
+              <w:spacing w:after="0"/>
+            </w:pPr>
+            <w:r>
+              <w:rPr>
+                <w:b w:val="false"/>
+                <w:bCs w:val="false"/>
+                <w:sz w:val="19"/>
+                <w:szCs w:val="19"/>
+              </w:rPr>
+              <w:t xml:space="preserve">4</w:t>
+            </w:r>
+          </w:p>
+        </w:tc>
+        <w:tc>
+          <w:tcPr>
+            <w:tcW w:type="dxa" w:w="1700"/>
+            <w:tcBorders>
+              <w:top w:val="single" w:color="BFBFBF" w:sz="4"/>
+              <w:left w:val="single" w:color="BFBFBF" w:sz="4"/>
+              <w:bottom w:val="single" w:color="BFBFBF" w:sz="4"/>
+              <w:right w:val="single" w:color="BFBFBF" w:sz="4"/>
+            </w:tcBorders>
+            <w:tcMar>
+              <w:top w:type="dxa" w:w="60"/>
+              <w:left w:type="dxa" w:w="100"/>
+              <w:bottom w:type="dxa" w:w="60"/>
+              <w:right w:type="dxa" w:w="100"/>
+            </w:tcMar>
+          </w:tcPr>
+          <w:p>
+            <w:pPr>
+              <w:spacing w:after="0"/>
+            </w:pPr>
+            <w:r>
+              <w:rPr>
+                <w:b w:val="false"/>
+                <w:bCs w:val="false"/>
+                <w:sz w:val="19"/>
+                <w:szCs w:val="19"/>
+              </w:rPr>
+              <w:t xml:space="preserve">0</w:t>
+            </w:r>
+          </w:p>
+        </w:tc>
+      </w:tr>
+    </w:tbl>
+    <w:p>
+      <w:pPr>
+        <w:spacing w:after="160"/>
+      </w:pPr>
+    </w:p>
+    <w:p>
+      <w:pPr>
+        <w:spacing w:after="160" w:line="288"/>
+      </w:pPr>
+      <w:r>
+        <w:t xml:space="preserve">Mobile profile: iPhone 15, Chrome 152, 4G (9 Mbps, 170 ms RTT), Singapore. Desktop profile: Chrome 152, WiFi (240/120 Mbps, 2 ms RTT), Tokyo. Anonymous WebPageTest allows a single run per test, so these values have no median and are more variable than the three-run Lighthouse results.</w:t>
+      </w:r>
+    </w:p>
+    <w:p>
+      <w:pPr>
+        <w:spacing w:after="160" w:line="288"/>
+      </w:pPr>
+      <w:r>
+        <w:rPr>
+          <w:b/>
+          <w:bCs/>
+        </w:rPr>
+        <w:t xml:space="preserve">What the hosted tests showed that the local tests did not.</w:t>
+      </w:r>
+    </w:p>
+    <w:p>
+      <w:pPr>
+        <w:pStyle w:val="ListParagraph"/>
+        <w:numPr>
+          <w:ilvl w:val="0"/>
+          <w:numId w:val="2"/>
+        </w:numPr>
+        <w:spacing w:after="80" w:line="276"/>
+      </w:pPr>
+      <w:r>
+        <w:rPr>
+          <w:b/>
+          <w:bCs/>
+        </w:rPr>
+        <w:t xml:space="preserve">A real layout shift on the baseline.</w:t>
+      </w:r>
+      <w:r>
+        <w:t xml:space="preserve"> Lighthouse measured CLS 0 locally because the images arrived before the first paint. On the real network the desktop baseline scored CLS 0.439 (“major layout shifts”) as the unsized images loaded and pushed the content down. The optimised page, which sets width and height on every image, stayed at 0.</w:t>
+      </w:r>
+    </w:p>
+    <w:p>
+      <w:pPr>
+        <w:pStyle w:val="ListParagraph"/>
+        <w:numPr>
+          <w:ilvl w:val="0"/>
+          <w:numId w:val="2"/>
+        </w:numPr>
+        <w:spacing w:after="80" w:line="276"/>
+      </w:pPr>
+      <w:r>
+        <w:rPr>
+          <w:b/>
+          <w:bCs/>
+        </w:rPr>
+        <w:t xml:space="preserve">A missing favicon on the baseline.</w:t>
+      </w:r>
+      <w:r>
+        <w:t xml:space="preserve"> Without a &lt;link rel="icon"&gt;, the browser requested takshaksinghania.github.io/favicon.ico from the domain root, which returned 404. This only appears when the site is hosted below a domain root. The optimised page links its own favicon and had no failed requests.</w:t>
+      </w:r>
+    </w:p>
+    <w:p>
+      <w:pPr>
+        <w:pStyle w:val="ListParagraph"/>
+        <w:numPr>
+          <w:ilvl w:val="0"/>
+          <w:numId w:val="2"/>
+        </w:numPr>
+        <w:spacing w:after="80" w:line="276"/>
+      </w:pPr>
+      <w:r>
+        <w:rPr>
+          <w:b/>
+          <w:bCs/>
+        </w:rPr>
+        <w:t xml:space="preserve">Lazy loading on a real network.</w:t>
+      </w:r>
+      <w:r>
+        <w:t xml:space="preserve"> The optimised mobile run downloaded only the HTML, the script, the 1600 px AVIF hero (the right size for the iPhone 15’s 3× screen), the map and the favicon: 18 KB in 5 requests. The event images further down were never requested.</w:t>
+      </w:r>
+    </w:p>
+    <w:p>
+      <w:pPr>
+        <w:pStyle w:val="ListParagraph"/>
+        <w:numPr>
+          <w:ilvl w:val="0"/>
+          <w:numId w:val="2"/>
+        </w:numPr>
+        <w:spacing w:after="80" w:line="276"/>
+      </w:pPr>
+      <w:r>
+        <w:rPr>
+          <w:b/>
+          <w:bCs/>
+        </w:rPr>
+        <w:t xml:space="preserve">The server is not the difference.</w:t>
+      </w:r>
+      <w:r>
+        <w:t xml:space="preserve"> Time to first byte was the same for both pages (about 0.95 s on mobile, 0.22 s on desktop) because it reflects GitHub Pages and the network. The gap in FCP, LCP and Speed Index comes entirely from what each page loads after the first byte: 4 render-blocking files and 6.3 MB of images for the baseline, against none and 18–34 KB for the optimised page.</w:t>
+      </w:r>
+    </w:p>
+    <w:p>
+      <w:pPr>
+        <w:spacing w:after="60" w:before="120"/>
+        <w:jc w:val="center"/>
+      </w:pPr>
+      <w:r>
+        <w:drawing>
+          <wp:inline distT="0" distB="0" distL="0" distR="0">
+            <wp:extent cx="2667000" cy="3409950"/>
+            <wp:effectExtent t="0" r="0" b="0" l="0"/>
+            <wp:docPr id="9" name="figure" descr="Figure 9 — WebPageTest, baseline on desktop: CLS 0.439 from unsized images." title="Figure 9 — WebPageTest, baseline on desktop: CLS 0.439 from unsized images."/>
+            <wp:cNvGraphicFramePr>
+              <a:graphicFrameLocks xmlns:a="http://schemas.openxmlformats.org/drawingml/2006/main" noChangeAspect="1"/>
+            </wp:cNvGraphicFramePr>
+            <a:graphic xmlns:a="http://schemas.openxmlformats.org/drawingml/2006/main">
+              <a:graphicData uri="http://schemas.openxmlformats.org/drawingml/2006/picture">
+                <pic:pic xmlns:pic="http://schemas.openxmlformats.org/drawingml/2006/picture">
+                  <pic:nvPicPr>
+                    <pic:cNvPr id="0" name="" descr=""/>
+                    <pic:cNvPicPr>
+                      <a:picLocks noChangeAspect="1" noChangeArrowheads="1"/>
+                    </pic:cNvPicPr>
+                  </pic:nvPicPr>
+                  <pic:blipFill>
+                    <a:blip r:embed="rId17" cstate="none"/>
+                    <a:srcRect/>
+                    <a:stretch>
+                      <a:fillRect/>
+                    </a:stretch>
+                  </pic:blipFill>
+                  <pic:spPr bwMode="auto">
+                    <a:xfrm>
+                      <a:off x="0" y="0"/>
+                      <a:ext cx="2667000" cy="3409950"/>
+                    </a:xfrm>
+                    <a:prstGeom prst="rect">
+                      <a:avLst/>
+                    </a:prstGeom>
+                  </pic:spPr>
+                </pic:pic>
+              </a:graphicData>
+            </a:graphic>
+          </wp:inline>
+        </w:drawing>
+      </w:r>
+    </w:p>
+    <w:p>
+      <w:pPr>
+        <w:spacing w:after="240"/>
+        <w:jc w:val="center"/>
+      </w:pPr>
+      <w:r>
+        <w:rPr>
+          <w:i/>
+          <w:iCs/>
+          <w:color w:val="595959"/>
+          <w:sz w:val="18"/>
+          <w:szCs w:val="18"/>
+        </w:rPr>
+        <w:t xml:space="preserve">Figure 9 — WebPageTest, baseline on desktop: CLS 0.439 from unsized images.</w:t>
+      </w:r>
+    </w:p>
+    <w:p>
+      <w:pPr>
+        <w:spacing w:after="60" w:before="120"/>
+        <w:jc w:val="center"/>
+      </w:pPr>
+      <w:r>
+        <w:drawing>
+          <wp:inline distT="0" distB="0" distL="0" distR="0">
+            <wp:extent cx="2667000" cy="3409950"/>
+            <wp:effectExtent t="0" r="0" b="0" l="0"/>
+            <wp:docPr id="10" name="figure" descr="Figure 10 — WebPageTest, optimised page on iPhone 15 / 4G: LCP 1.63 s, 18 KB." title="Figure 10 — WebPageTest, optimised page on iPhone 15 / 4G: LCP 1.63 s, 18 KB."/>
+            <wp:cNvGraphicFramePr>
+              <a:graphicFrameLocks xmlns:a="http://schemas.openxmlformats.org/drawingml/2006/main" noChangeAspect="1"/>
+            </wp:cNvGraphicFramePr>
+            <a:graphic xmlns:a="http://schemas.openxmlformats.org/drawingml/2006/main">
+              <a:graphicData uri="http://schemas.openxmlformats.org/drawingml/2006/picture">
+                <pic:pic xmlns:pic="http://schemas.openxmlformats.org/drawingml/2006/picture">
+                  <pic:nvPicPr>
+                    <pic:cNvPr id="0" name="" descr=""/>
+                    <pic:cNvPicPr>
+                      <a:picLocks noChangeAspect="1" noChangeArrowheads="1"/>
+                    </pic:cNvPicPr>
+                  </pic:nvPicPr>
+                  <pic:blipFill>
+                    <a:blip r:embed="rId18" cstate="none"/>
+                    <a:srcRect/>
+                    <a:stretch>
+                      <a:fillRect/>
+                    </a:stretch>
+                  </pic:blipFill>
+                  <pic:spPr bwMode="auto">
+                    <a:xfrm>
+                      <a:off x="0" y="0"/>
+                      <a:ext cx="2667000" cy="3409950"/>
+                    </a:xfrm>
+                    <a:prstGeom prst="rect">
+                      <a:avLst/>
+                    </a:prstGeom>
+                  </pic:spPr>
+                </pic:pic>
+              </a:graphicData>
+            </a:graphic>
+          </wp:inline>
+        </w:drawing>
+      </w:r>
+    </w:p>
+    <w:p>
+      <w:pPr>
+        <w:spacing w:after="240"/>
+        <w:jc w:val="center"/>
+      </w:pPr>
+      <w:r>
+        <w:rPr>
+          <w:i/>
+          <w:iCs/>
+          <w:color w:val="595959"/>
+          <w:sz w:val="18"/>
+          <w:szCs w:val="18"/>
+        </w:rPr>
+        <w:t xml:space="preserve">Figure 10 — WebPageTest, optimised page on iPhone 15 / 4G: LCP 1.63 s, 18 KB.</w:t>
+      </w:r>
+    </w:p>
+    <w:p>
+      <w:pPr>
         <w:pStyle w:val="Heading1"/>
       </w:pPr>
       <w:r>
@@ -10014,6 +12880,70 @@
                 <w:szCs w:val="19"/>
               </w:rPr>
               <w:t xml:space="preserve">The first audit run validated the optimised HTML without loading the project’s html-validate config and wrongly reported 2 errors for the checkbox group (checkboxes legitimately share one name). The script now loads the config for both pages, and the final result is 0 errors.</w:t>
+            </w:r>
+          </w:p>
+        </w:tc>
+      </w:tr>
+      <w:tr>
+        <w:tc>
+          <w:tcPr>
+            <w:tcW w:type="dxa" w:w="3600"/>
+            <w:tcBorders>
+              <w:top w:val="single" w:color="BFBFBF" w:sz="4"/>
+              <w:left w:val="single" w:color="BFBFBF" w:sz="4"/>
+              <w:bottom w:val="single" w:color="BFBFBF" w:sz="4"/>
+              <w:right w:val="single" w:color="BFBFBF" w:sz="4"/>
+            </w:tcBorders>
+            <w:tcMar>
+              <w:top w:type="dxa" w:w="60"/>
+              <w:left w:type="dxa" w:w="100"/>
+              <w:bottom w:type="dxa" w:w="60"/>
+              <w:right w:type="dxa" w:w="100"/>
+            </w:tcMar>
+          </w:tcPr>
+          <w:p>
+            <w:pPr>
+              <w:spacing w:after="0"/>
+            </w:pPr>
+            <w:r>
+              <w:rPr>
+                <w:b w:val="false"/>
+                <w:bCs w:val="false"/>
+                <w:sz w:val="19"/>
+                <w:szCs w:val="19"/>
+              </w:rPr>
+              <w:t xml:space="preserve">Problems that only appear on a real host</w:t>
+            </w:r>
+          </w:p>
+        </w:tc>
+        <w:tc>
+          <w:tcPr>
+            <w:tcW w:type="dxa" w:w="5426"/>
+            <w:tcBorders>
+              <w:top w:val="single" w:color="BFBFBF" w:sz="4"/>
+              <w:left w:val="single" w:color="BFBFBF" w:sz="4"/>
+              <w:bottom w:val="single" w:color="BFBFBF" w:sz="4"/>
+              <w:right w:val="single" w:color="BFBFBF" w:sz="4"/>
+            </w:tcBorders>
+            <w:tcMar>
+              <w:top w:type="dxa" w:w="60"/>
+              <w:left w:type="dxa" w:w="100"/>
+              <w:bottom w:type="dxa" w:w="60"/>
+              <w:right w:type="dxa" w:w="100"/>
+            </w:tcMar>
+          </w:tcPr>
+          <w:p>
+            <w:pPr>
+              <w:spacing w:after="0"/>
+            </w:pPr>
+            <w:r>
+              <w:rPr>
+                <w:b w:val="false"/>
+                <w:bCs w:val="false"/>
+                <w:sz w:val="19"/>
+                <w:szCs w:val="19"/>
+              </w:rPr>
+              <w:t xml:space="preserve">Published both versions with GitHub Pages and ran WAVE and WebPageTest there. This revealed a 0.439 layout shift and a favicon 404 on the baseline that the local tests could not show, and confirmed the optimised page has neither.</w:t>
             </w:r>
           </w:p>
         </w:tc>
@@ -10110,10 +13040,10 @@
           <w:b/>
           <w:bCs/>
         </w:rPr>
-        <w:t xml:space="preserve">WAVE and WebPageTest were not run</w:t>
+        <w:t xml:space="preserve">WebPageTest was run anonymously</w:t>
       </w:r>
       <w:r>
-        <w:t xml:space="preserve"> because they need a public URL. To reproduce: publish the repository with GitHub Pages, then (1) run the URL through https://wave.webaim.org/ or the WAVE browser extension, and (2) run a WebPageTest test (for example Moto G4, 4G, 3 runs) for both / and /baseline/.</w:t>
+        <w:t xml:space="preserve">, which allows one run per test and a fixed list of devices. Signing in to a free account would allow 3+ runs per profile and a median, as was done with Lighthouse.</w:t>
       </w:r>
     </w:p>
     <w:p>
@@ -10152,7 +13082,7 @@
         <w:spacing w:after="80" w:line="276"/>
       </w:pPr>
       <w:r>
-        <w:t xml:space="preserve">Results are lab measurements on a local server. Field data (real-user Core Web Vitals) would need the page to be hosted and visited.</w:t>
+        <w:t xml:space="preserve">All performance results are lab measurements (local Lighthouse and WebPageTest’s emulated devices). Field data (real-user Core Web Vitals) would need real visitors to the hosted page.</w:t>
       </w:r>
     </w:p>
     <w:p>
@@ -10194,7 +13124,7 @@
         <w:spacing w:after="160" w:line="288"/>
       </w:pPr>
       <w:r>
-        <w:t xml:space="preserve">Starting from a baseline with 9 failing axe rules, 6 validation errors, 6.5 MB of transfer and a 35-second mobile LCP, the optimised page reaches 100 in all four main Lighthouse categories on both mobile and desktop, has zero axe violations and zero validation errors, and transfers 49 KB on mobile. Most of the gain came from three changes: replacing oversized PNGs with responsive AVIF images, removing two unused libraries, and loading the remaining tiny CSS and JavaScript without blocking rendering. Most of the accessibility work was making the page semantic and native: real landmarks, headings, labels, buttons and details elements, a visible focus style, sufficient contrast, and form errors that are announced and linked. The main lesson is to measure before and after every change: the critical-CSS decision, for example, was justified by a measured 149 ms improvement rather than by habit.</w:t>
+        <w:t xml:space="preserve">Starting from a baseline with 9 failing axe rules, 6 validation errors, 6.5 MB of transfer and a 35-second mobile LCP, the optimised page reaches 100 in all four main Lighthouse categories on both mobile and desktop, has zero axe violations and zero validation errors, and transfers 49 KB on mobile. On the public GitHub Pages copy, WAVE reports 0 errors and 0 contrast errors (against 7 and 32 for the baseline), and WebPageTest on a real 4G profile measured LCP of 1.63 s against 5.11 s for the baseline, with no render-blocking requests and no layout shift. Most of the gain came from three changes: replacing oversized PNGs with responsive AVIF images, removing two unused libraries, and loading the remaining tiny CSS and JavaScript without blocking rendering. Most of the accessibility work was making the page semantic and native: real landmarks, headings, labels, buttons and details elements, a visible focus style, sufficient contrast, and form errors that are announced and linked. The main lesson is to measure before and after every change: the critical-CSS decision, for example, was justified by a measured 149 ms improvement rather than by habit.</w:t>
       </w:r>
     </w:p>
     <w:sectPr>

</xml_diff>

<commit_message>
docs: note that the GitHub Pages test deployment is offline
Pages publishing was disabled after the WAVE and WebPageTest runs. The
recorded hosted results and screenshots are kept unchanged.
</commit_message>
<xml_diff>
--- a/report.docx
+++ b/report.docx
@@ -484,7 +484,7 @@
                 <w:sz w:val="19"/>
                 <w:szCs w:val="19"/>
               </w:rPr>
-              <w:t xml:space="preserve">Live site</w:t>
+              <w:t xml:space="preserve">Hosted test site</w:t>
             </w:r>
           </w:p>
         </w:tc>
@@ -515,7 +515,7 @@
                 <w:sz w:val="19"/>
                 <w:szCs w:val="19"/>
               </w:rPr>
-              <w:t xml:space="preserve">https://takshaksinghania.github.io/frontend-internship-week4-performance-accessibility/ (baseline at /baseline/)</w:t>
+              <w:t xml:space="preserve">https://takshaksinghania.github.io/frontend-internship-week4-performance-accessibility/ (baseline at /baseline/); taken offline 23 October 2026 after testing</w:t>
             </w:r>
           </w:p>
         </w:tc>
@@ -9820,6 +9820,19 @@
       </w:pPr>
       <w:r>
         <w:t xml:space="preserve">9.3 Hosted tests: WAVE and WebPageTest</w:t>
+      </w:r>
+    </w:p>
+    <w:p>
+      <w:pPr>
+        <w:pBdr>
+          <w:left w:val="single" w:color="1F4E79" w:sz="18" w:space="8"/>
+        </w:pBdr>
+        <w:shd w:fill="EEF3F8" w:color="auto" w:val="clear"/>
+        <w:spacing w:after="200" w:before="120" w:line="276"/>
+        <w:ind w:left="240" w:right="240"/>
+      </w:pPr>
+      <w:r>
+        <w:t xml:space="preserve">The GitHub Pages deployment was taken offline on 23 October 2026 after testing, so these addresses no longer load. The measurements below were recorded while it was live and are unchanged.</w:t>
       </w:r>
     </w:p>
     <w:p>

</xml_diff>